<commit_message>
Added Google Pay and Apple Pay support
</commit_message>
<xml_diff>
--- a/docs/Svea_Payment_Gateway_Manual.docx
+++ b/docs/Svea_Payment_Gateway_Manual.docx
@@ -343,7 +343,15 @@
           <w:iCs/>
           <w:szCs w:val="22"/>
         </w:rPr>
-        <w:t>7.0</w:t>
+        <w:t>7.</w:t>
+      </w:r>
+      <w:r>
+        <w:rPr>
+          <w:i/>
+          <w:iCs/>
+          <w:szCs w:val="22"/>
+        </w:rPr>
+        <w:t>1</w:t>
       </w:r>
     </w:p>
     <w:p>
@@ -5013,6 +5021,9 @@
         <w:pStyle w:val="Textbody"/>
       </w:pPr>
       <w:r>
+        <w:rPr>
+          <w:noProof/>
+        </w:rPr>
         <w:lastRenderedPageBreak/>
         <w:drawing>
           <wp:inline distT="0" distB="0" distL="0" distR="0" wp14:anchorId="36F37FA5" wp14:editId="3FE6607A">
@@ -5112,10 +5123,7 @@
         <w:t>Enable this if you are using WooCommerce Block Mode supported theme</w:t>
       </w:r>
       <w:r>
-        <w:t xml:space="preserve">. </w:t>
-      </w:r>
-      <w:r>
-        <w:t>Use this</w:t>
+        <w:t>. Use this</w:t>
       </w:r>
       <w:r>
         <w:t>,</w:t>
@@ -5136,10 +5144,7 @@
         <w:t>short codes</w:t>
       </w:r>
       <w:r>
-        <w:t>. Otherwise,</w:t>
-      </w:r>
-      <w:r>
-        <w:t xml:space="preserve"> you don’t see any payment methods on checkout page.</w:t>
+        <w:t>. Otherwise, you don’t see any payment methods on checkout page.</w:t>
       </w:r>
     </w:p>
     <w:p>
@@ -5151,83 +5156,74 @@
       <w:pPr>
         <w:pStyle w:val="Heading2"/>
       </w:pPr>
-      <w:bookmarkStart w:id="71" w:name="_Toc11353203"/>
-      <w:bookmarkStart w:id="72" w:name="_Toc11353129"/>
-      <w:bookmarkStart w:id="73" w:name="_Toc11253830"/>
-      <w:bookmarkStart w:id="74" w:name="_Toc11144783"/>
-      <w:bookmarkStart w:id="75" w:name="_Toc10743694"/>
-      <w:bookmarkStart w:id="76" w:name="_Toc10741274"/>
-      <w:bookmarkStart w:id="77" w:name="_Toc10646648"/>
-      <w:bookmarkStart w:id="78" w:name="_Ref216539626"/>
-      <w:bookmarkStart w:id="79" w:name="_Toc216540516"/>
+      <w:bookmarkStart w:id="71" w:name="_Ref216539626"/>
+      <w:bookmarkStart w:id="72" w:name="_Toc216540516"/>
+      <w:bookmarkStart w:id="73" w:name="_Toc11353203"/>
+      <w:bookmarkStart w:id="74" w:name="_Toc11353129"/>
+      <w:bookmarkStart w:id="75" w:name="_Toc11253830"/>
+      <w:bookmarkStart w:id="76" w:name="_Toc11144783"/>
+      <w:bookmarkStart w:id="77" w:name="_Toc10743694"/>
+      <w:bookmarkStart w:id="78" w:name="_Toc10741274"/>
+      <w:bookmarkStart w:id="79" w:name="_Toc10646648"/>
       <w:r>
         <w:lastRenderedPageBreak/>
         <w:t>Redirect to Svea’s Payment Method Selection Page</w:t>
       </w:r>
-      <w:bookmarkEnd w:id="78"/>
-      <w:bookmarkEnd w:id="79"/>
-    </w:p>
-    <w:p>
-      <w:pPr>
-        <w:pStyle w:val="Textbody"/>
-      </w:pPr>
-      <w:r>
-        <w:t>Use this option, if you want to use the payment method selection page on the Svea Payment’s web pages instead of WooCommerce Checkout payment selection on the checkout page.</w:t>
-      </w:r>
-    </w:p>
-    <w:p>
-      <w:pPr>
-        <w:pStyle w:val="Textbody"/>
-      </w:pPr>
-      <w:r>
-        <w:t>See</w:t>
-      </w:r>
-      <w:r>
-        <w:t xml:space="preserve"> Chapter</w:t>
-      </w:r>
-      <w:r>
-        <w:t xml:space="preserve"> </w:t>
-      </w:r>
-      <w:r>
-        <w:fldChar w:fldCharType="begin"/>
-      </w:r>
-      <w:r>
-        <w:instrText xml:space="preserve"> REF _Ref216538941 \r \h </w:instrText>
-      </w:r>
-      <w:r>
-        <w:fldChar w:fldCharType="separate"/>
-      </w:r>
-      <w:r>
-        <w:t>6.1</w:t>
-      </w:r>
-      <w:r>
-        <w:fldChar w:fldCharType="end"/>
-      </w:r>
-      <w:r>
-        <w:t xml:space="preserve"> </w:t>
-      </w:r>
-      <w:r>
-        <w:t>for more.</w:t>
-      </w:r>
-    </w:p>
-    <w:p>
-      <w:pPr>
-        <w:pStyle w:val="Heading2"/>
-      </w:pPr>
-      <w:bookmarkStart w:id="80" w:name="_Toc216540517"/>
-      <w:r>
-        <w:t xml:space="preserve">Redirect to Svea’s Payment Method </w:t>
-      </w:r>
-      <w:r>
-        <w:t>Title</w:t>
-      </w:r>
       <w:bookmarkEnd w:id="71"/>
       <w:bookmarkEnd w:id="72"/>
+    </w:p>
+    <w:p>
+      <w:pPr>
+        <w:pStyle w:val="Textbody"/>
+      </w:pPr>
+      <w:r>
+        <w:t>Use this option, if you want to use the payment method selection page on the Svea Payment’s web pages instead of WooCommerce Checkout payment selection on the checkout page.</w:t>
+      </w:r>
+    </w:p>
+    <w:p>
+      <w:pPr>
+        <w:pStyle w:val="Textbody"/>
+      </w:pPr>
+      <w:r>
+        <w:t xml:space="preserve">See Chapter </w:t>
+      </w:r>
+      <w:r>
+        <w:fldChar w:fldCharType="begin"/>
+      </w:r>
+      <w:r>
+        <w:instrText xml:space="preserve"> REF _Ref216538941 \r \h </w:instrText>
+      </w:r>
+      <w:r>
+        <w:fldChar w:fldCharType="separate"/>
+      </w:r>
+      <w:r>
+        <w:t>6.1</w:t>
+      </w:r>
+      <w:r>
+        <w:fldChar w:fldCharType="end"/>
+      </w:r>
+      <w:r>
+        <w:t xml:space="preserve"> for more.</w:t>
+      </w:r>
+    </w:p>
+    <w:p>
+      <w:pPr>
+        <w:pStyle w:val="Heading2"/>
+      </w:pPr>
+      <w:bookmarkStart w:id="80" w:name="_Toc216540517"/>
+      <w:r>
+        <w:t xml:space="preserve">Redirect to Svea’s Payment Method </w:t>
+      </w:r>
+      <w:r>
+        <w:t>Title</w:t>
+      </w:r>
       <w:bookmarkEnd w:id="73"/>
       <w:bookmarkEnd w:id="74"/>
       <w:bookmarkEnd w:id="75"/>
       <w:bookmarkEnd w:id="76"/>
       <w:bookmarkEnd w:id="77"/>
+      <w:bookmarkEnd w:id="78"/>
+      <w:bookmarkEnd w:id="79"/>
       <w:bookmarkEnd w:id="80"/>
     </w:p>
     <w:p>
@@ -5286,18 +5282,18 @@
       <w:pPr>
         <w:pStyle w:val="Heading2"/>
       </w:pPr>
-      <w:bookmarkStart w:id="89" w:name="_Toc11353205"/>
-      <w:bookmarkStart w:id="90" w:name="_Toc11353131"/>
-      <w:bookmarkStart w:id="91" w:name="_Toc11253832"/>
-      <w:bookmarkStart w:id="92" w:name="_Toc11144785"/>
-      <w:bookmarkStart w:id="93" w:name="_Toc10743696"/>
-      <w:bookmarkStart w:id="94" w:name="_Toc10741276"/>
-      <w:bookmarkStart w:id="95" w:name="_Toc10646650"/>
-      <w:bookmarkStart w:id="96" w:name="_Toc216540519"/>
+      <w:bookmarkStart w:id="89" w:name="_Toc216540519"/>
+      <w:bookmarkStart w:id="90" w:name="_Toc11353205"/>
+      <w:bookmarkStart w:id="91" w:name="_Toc11353131"/>
+      <w:bookmarkStart w:id="92" w:name="_Toc11253832"/>
+      <w:bookmarkStart w:id="93" w:name="_Toc11144785"/>
+      <w:bookmarkStart w:id="94" w:name="_Toc10743696"/>
+      <w:bookmarkStart w:id="95" w:name="_Toc10741276"/>
+      <w:bookmarkStart w:id="96" w:name="_Toc10646650"/>
       <w:r>
         <w:t>Payment handling fees</w:t>
       </w:r>
-      <w:bookmarkEnd w:id="96"/>
+      <w:bookmarkEnd w:id="89"/>
     </w:p>
     <w:p>
       <w:pPr>
@@ -5445,13 +5441,13 @@
       <w:r>
         <w:t>d</w:t>
       </w:r>
-      <w:bookmarkEnd w:id="89"/>
       <w:bookmarkEnd w:id="90"/>
       <w:bookmarkEnd w:id="91"/>
       <w:bookmarkEnd w:id="92"/>
       <w:bookmarkEnd w:id="93"/>
       <w:bookmarkEnd w:id="94"/>
       <w:bookmarkEnd w:id="95"/>
+      <w:bookmarkEnd w:id="96"/>
       <w:r>
         <w:t xml:space="preserve">, </w:t>
       </w:r>
@@ -5825,6 +5821,9 @@
         <w:br/>
       </w:r>
       <w:r>
+        <w:rPr>
+          <w:noProof/>
+        </w:rPr>
         <w:drawing>
           <wp:inline distT="0" distB="0" distL="0" distR="0" wp14:anchorId="5685F1C4" wp14:editId="6FCEC380">
             <wp:extent cx="3730028" cy="2747118"/>
@@ -6276,6 +6275,9 @@
         <w:pStyle w:val="Textbody"/>
       </w:pPr>
       <w:r>
+        <w:rPr>
+          <w:noProof/>
+        </w:rPr>
         <w:lastRenderedPageBreak/>
         <w:drawing>
           <wp:inline distT="0" distB="0" distL="0" distR="0" wp14:anchorId="6D1C2B98" wp14:editId="6827D049">
@@ -6327,6 +6329,9 @@
         <w:pStyle w:val="Textbody"/>
       </w:pPr>
       <w:r>
+        <w:rPr>
+          <w:noProof/>
+        </w:rPr>
         <w:drawing>
           <wp:inline distT="0" distB="0" distL="0" distR="0" wp14:anchorId="469457EC" wp14:editId="39CDE73A">
             <wp:extent cx="5021383" cy="4300396"/>
@@ -6642,6 +6647,9 @@
         <w:br/>
       </w:r>
       <w:r>
+        <w:rPr>
+          <w:noProof/>
+        </w:rPr>
         <w:drawing>
           <wp:inline distT="0" distB="0" distL="0" distR="0" wp14:anchorId="14D49CDF" wp14:editId="1212367F">
             <wp:extent cx="6120765" cy="3067685"/>
@@ -8515,7 +8523,7 @@
         <w:sz w:val="20"/>
         <w:szCs w:val="20"/>
       </w:rPr>
-      <w:t>13</w:t>
+      <w:t>1</w:t>
     </w:r>
     <w:r>
       <w:rPr>
@@ -8531,7 +8539,7 @@
         <w:sz w:val="20"/>
         <w:szCs w:val="20"/>
       </w:rPr>
-      <w:t>12</w:t>
+      <w:t>3</w:t>
     </w:r>
     <w:r>
       <w:rPr>
@@ -8555,7 +8563,7 @@
         <w:sz w:val="20"/>
         <w:szCs w:val="20"/>
       </w:rPr>
-      <w:t>5</w:t>
+      <w:t>6</w:t>
     </w:r>
   </w:p>
 </w:hdr>

</xml_diff>

<commit_message>
Apple and Google Pay
</commit_message>
<xml_diff>
--- a/docs/Svea_Payment_Gateway_Manual.docx
+++ b/docs/Svea_Payment_Gateway_Manual.docx
@@ -343,7 +343,15 @@
           <w:iCs/>
           <w:szCs w:val="22"/>
         </w:rPr>
-        <w:t>7.0</w:t>
+        <w:t>7.</w:t>
+      </w:r>
+      <w:r>
+        <w:rPr>
+          <w:i/>
+          <w:iCs/>
+          <w:szCs w:val="22"/>
+        </w:rPr>
+        <w:t>1</w:t>
       </w:r>
     </w:p>
     <w:p>
@@ -5013,6 +5021,9 @@
         <w:pStyle w:val="Textbody"/>
       </w:pPr>
       <w:r>
+        <w:rPr>
+          <w:noProof/>
+        </w:rPr>
         <w:lastRenderedPageBreak/>
         <w:drawing>
           <wp:inline distT="0" distB="0" distL="0" distR="0" wp14:anchorId="36F37FA5" wp14:editId="3FE6607A">
@@ -5112,10 +5123,7 @@
         <w:t>Enable this if you are using WooCommerce Block Mode supported theme</w:t>
       </w:r>
       <w:r>
-        <w:t xml:space="preserve">. </w:t>
-      </w:r>
-      <w:r>
-        <w:t>Use this</w:t>
+        <w:t>. Use this</w:t>
       </w:r>
       <w:r>
         <w:t>,</w:t>
@@ -5136,10 +5144,7 @@
         <w:t>short codes</w:t>
       </w:r>
       <w:r>
-        <w:t>. Otherwise,</w:t>
-      </w:r>
-      <w:r>
-        <w:t xml:space="preserve"> you don’t see any payment methods on checkout page.</w:t>
+        <w:t>. Otherwise, you don’t see any payment methods on checkout page.</w:t>
       </w:r>
     </w:p>
     <w:p>
@@ -5151,83 +5156,74 @@
       <w:pPr>
         <w:pStyle w:val="Heading2"/>
       </w:pPr>
-      <w:bookmarkStart w:id="71" w:name="_Toc11353203"/>
-      <w:bookmarkStart w:id="72" w:name="_Toc11353129"/>
-      <w:bookmarkStart w:id="73" w:name="_Toc11253830"/>
-      <w:bookmarkStart w:id="74" w:name="_Toc11144783"/>
-      <w:bookmarkStart w:id="75" w:name="_Toc10743694"/>
-      <w:bookmarkStart w:id="76" w:name="_Toc10741274"/>
-      <w:bookmarkStart w:id="77" w:name="_Toc10646648"/>
-      <w:bookmarkStart w:id="78" w:name="_Ref216539626"/>
-      <w:bookmarkStart w:id="79" w:name="_Toc216540516"/>
+      <w:bookmarkStart w:id="71" w:name="_Ref216539626"/>
+      <w:bookmarkStart w:id="72" w:name="_Toc216540516"/>
+      <w:bookmarkStart w:id="73" w:name="_Toc11353203"/>
+      <w:bookmarkStart w:id="74" w:name="_Toc11353129"/>
+      <w:bookmarkStart w:id="75" w:name="_Toc11253830"/>
+      <w:bookmarkStart w:id="76" w:name="_Toc11144783"/>
+      <w:bookmarkStart w:id="77" w:name="_Toc10743694"/>
+      <w:bookmarkStart w:id="78" w:name="_Toc10741274"/>
+      <w:bookmarkStart w:id="79" w:name="_Toc10646648"/>
       <w:r>
         <w:lastRenderedPageBreak/>
         <w:t>Redirect to Svea’s Payment Method Selection Page</w:t>
       </w:r>
-      <w:bookmarkEnd w:id="78"/>
-      <w:bookmarkEnd w:id="79"/>
-    </w:p>
-    <w:p>
-      <w:pPr>
-        <w:pStyle w:val="Textbody"/>
-      </w:pPr>
-      <w:r>
-        <w:t>Use this option, if you want to use the payment method selection page on the Svea Payment’s web pages instead of WooCommerce Checkout payment selection on the checkout page.</w:t>
-      </w:r>
-    </w:p>
-    <w:p>
-      <w:pPr>
-        <w:pStyle w:val="Textbody"/>
-      </w:pPr>
-      <w:r>
-        <w:t>See</w:t>
-      </w:r>
-      <w:r>
-        <w:t xml:space="preserve"> Chapter</w:t>
-      </w:r>
-      <w:r>
-        <w:t xml:space="preserve"> </w:t>
-      </w:r>
-      <w:r>
-        <w:fldChar w:fldCharType="begin"/>
-      </w:r>
-      <w:r>
-        <w:instrText xml:space="preserve"> REF _Ref216538941 \r \h </w:instrText>
-      </w:r>
-      <w:r>
-        <w:fldChar w:fldCharType="separate"/>
-      </w:r>
-      <w:r>
-        <w:t>6.1</w:t>
-      </w:r>
-      <w:r>
-        <w:fldChar w:fldCharType="end"/>
-      </w:r>
-      <w:r>
-        <w:t xml:space="preserve"> </w:t>
-      </w:r>
-      <w:r>
-        <w:t>for more.</w:t>
-      </w:r>
-    </w:p>
-    <w:p>
-      <w:pPr>
-        <w:pStyle w:val="Heading2"/>
-      </w:pPr>
-      <w:bookmarkStart w:id="80" w:name="_Toc216540517"/>
-      <w:r>
-        <w:t xml:space="preserve">Redirect to Svea’s Payment Method </w:t>
-      </w:r>
-      <w:r>
-        <w:t>Title</w:t>
-      </w:r>
       <w:bookmarkEnd w:id="71"/>
       <w:bookmarkEnd w:id="72"/>
+    </w:p>
+    <w:p>
+      <w:pPr>
+        <w:pStyle w:val="Textbody"/>
+      </w:pPr>
+      <w:r>
+        <w:t>Use this option, if you want to use the payment method selection page on the Svea Payment’s web pages instead of WooCommerce Checkout payment selection on the checkout page.</w:t>
+      </w:r>
+    </w:p>
+    <w:p>
+      <w:pPr>
+        <w:pStyle w:val="Textbody"/>
+      </w:pPr>
+      <w:r>
+        <w:t xml:space="preserve">See Chapter </w:t>
+      </w:r>
+      <w:r>
+        <w:fldChar w:fldCharType="begin"/>
+      </w:r>
+      <w:r>
+        <w:instrText xml:space="preserve"> REF _Ref216538941 \r \h </w:instrText>
+      </w:r>
+      <w:r>
+        <w:fldChar w:fldCharType="separate"/>
+      </w:r>
+      <w:r>
+        <w:t>6.1</w:t>
+      </w:r>
+      <w:r>
+        <w:fldChar w:fldCharType="end"/>
+      </w:r>
+      <w:r>
+        <w:t xml:space="preserve"> for more.</w:t>
+      </w:r>
+    </w:p>
+    <w:p>
+      <w:pPr>
+        <w:pStyle w:val="Heading2"/>
+      </w:pPr>
+      <w:bookmarkStart w:id="80" w:name="_Toc216540517"/>
+      <w:r>
+        <w:t xml:space="preserve">Redirect to Svea’s Payment Method </w:t>
+      </w:r>
+      <w:r>
+        <w:t>Title</w:t>
+      </w:r>
       <w:bookmarkEnd w:id="73"/>
       <w:bookmarkEnd w:id="74"/>
       <w:bookmarkEnd w:id="75"/>
       <w:bookmarkEnd w:id="76"/>
       <w:bookmarkEnd w:id="77"/>
+      <w:bookmarkEnd w:id="78"/>
+      <w:bookmarkEnd w:id="79"/>
       <w:bookmarkEnd w:id="80"/>
     </w:p>
     <w:p>
@@ -5286,18 +5282,18 @@
       <w:pPr>
         <w:pStyle w:val="Heading2"/>
       </w:pPr>
-      <w:bookmarkStart w:id="89" w:name="_Toc11353205"/>
-      <w:bookmarkStart w:id="90" w:name="_Toc11353131"/>
-      <w:bookmarkStart w:id="91" w:name="_Toc11253832"/>
-      <w:bookmarkStart w:id="92" w:name="_Toc11144785"/>
-      <w:bookmarkStart w:id="93" w:name="_Toc10743696"/>
-      <w:bookmarkStart w:id="94" w:name="_Toc10741276"/>
-      <w:bookmarkStart w:id="95" w:name="_Toc10646650"/>
-      <w:bookmarkStart w:id="96" w:name="_Toc216540519"/>
+      <w:bookmarkStart w:id="89" w:name="_Toc216540519"/>
+      <w:bookmarkStart w:id="90" w:name="_Toc11353205"/>
+      <w:bookmarkStart w:id="91" w:name="_Toc11353131"/>
+      <w:bookmarkStart w:id="92" w:name="_Toc11253832"/>
+      <w:bookmarkStart w:id="93" w:name="_Toc11144785"/>
+      <w:bookmarkStart w:id="94" w:name="_Toc10743696"/>
+      <w:bookmarkStart w:id="95" w:name="_Toc10741276"/>
+      <w:bookmarkStart w:id="96" w:name="_Toc10646650"/>
       <w:r>
         <w:t>Payment handling fees</w:t>
       </w:r>
-      <w:bookmarkEnd w:id="96"/>
+      <w:bookmarkEnd w:id="89"/>
     </w:p>
     <w:p>
       <w:pPr>
@@ -5445,13 +5441,13 @@
       <w:r>
         <w:t>d</w:t>
       </w:r>
-      <w:bookmarkEnd w:id="89"/>
       <w:bookmarkEnd w:id="90"/>
       <w:bookmarkEnd w:id="91"/>
       <w:bookmarkEnd w:id="92"/>
       <w:bookmarkEnd w:id="93"/>
       <w:bookmarkEnd w:id="94"/>
       <w:bookmarkEnd w:id="95"/>
+      <w:bookmarkEnd w:id="96"/>
       <w:r>
         <w:t xml:space="preserve">, </w:t>
       </w:r>
@@ -5825,6 +5821,9 @@
         <w:br/>
       </w:r>
       <w:r>
+        <w:rPr>
+          <w:noProof/>
+        </w:rPr>
         <w:drawing>
           <wp:inline distT="0" distB="0" distL="0" distR="0" wp14:anchorId="5685F1C4" wp14:editId="6FCEC380">
             <wp:extent cx="3730028" cy="2747118"/>
@@ -6276,6 +6275,9 @@
         <w:pStyle w:val="Textbody"/>
       </w:pPr>
       <w:r>
+        <w:rPr>
+          <w:noProof/>
+        </w:rPr>
         <w:lastRenderedPageBreak/>
         <w:drawing>
           <wp:inline distT="0" distB="0" distL="0" distR="0" wp14:anchorId="6D1C2B98" wp14:editId="6827D049">
@@ -6327,6 +6329,9 @@
         <w:pStyle w:val="Textbody"/>
       </w:pPr>
       <w:r>
+        <w:rPr>
+          <w:noProof/>
+        </w:rPr>
         <w:drawing>
           <wp:inline distT="0" distB="0" distL="0" distR="0" wp14:anchorId="469457EC" wp14:editId="39CDE73A">
             <wp:extent cx="5021383" cy="4300396"/>
@@ -6642,6 +6647,9 @@
         <w:br/>
       </w:r>
       <w:r>
+        <w:rPr>
+          <w:noProof/>
+        </w:rPr>
         <w:drawing>
           <wp:inline distT="0" distB="0" distL="0" distR="0" wp14:anchorId="14D49CDF" wp14:editId="1212367F">
             <wp:extent cx="6120765" cy="3067685"/>
@@ -8515,7 +8523,7 @@
         <w:sz w:val="20"/>
         <w:szCs w:val="20"/>
       </w:rPr>
-      <w:t>13</w:t>
+      <w:t>1</w:t>
     </w:r>
     <w:r>
       <w:rPr>
@@ -8531,7 +8539,7 @@
         <w:sz w:val="20"/>
         <w:szCs w:val="20"/>
       </w:rPr>
-      <w:t>12</w:t>
+      <w:t>3</w:t>
     </w:r>
     <w:r>
       <w:rPr>
@@ -8555,7 +8563,7 @@
         <w:sz w:val="20"/>
         <w:szCs w:val="20"/>
       </w:rPr>
-      <w:t>5</w:t>
+      <w:t>6</w:t>
     </w:r>
   </w:p>
 </w:hdr>

</xml_diff>

<commit_message>
Apple and Google Pay (#105)
</commit_message>
<xml_diff>
--- a/docs/Svea_Payment_Gateway_Manual.docx
+++ b/docs/Svea_Payment_Gateway_Manual.docx
@@ -343,7 +343,15 @@
           <w:iCs/>
           <w:szCs w:val="22"/>
         </w:rPr>
-        <w:t>7.0</w:t>
+        <w:t>7.</w:t>
+      </w:r>
+      <w:r>
+        <w:rPr>
+          <w:i/>
+          <w:iCs/>
+          <w:szCs w:val="22"/>
+        </w:rPr>
+        <w:t>1</w:t>
       </w:r>
     </w:p>
     <w:p>
@@ -5013,6 +5021,9 @@
         <w:pStyle w:val="Textbody"/>
       </w:pPr>
       <w:r>
+        <w:rPr>
+          <w:noProof/>
+        </w:rPr>
         <w:lastRenderedPageBreak/>
         <w:drawing>
           <wp:inline distT="0" distB="0" distL="0" distR="0" wp14:anchorId="36F37FA5" wp14:editId="3FE6607A">
@@ -5112,10 +5123,7 @@
         <w:t>Enable this if you are using WooCommerce Block Mode supported theme</w:t>
       </w:r>
       <w:r>
-        <w:t xml:space="preserve">. </w:t>
-      </w:r>
-      <w:r>
-        <w:t>Use this</w:t>
+        <w:t>. Use this</w:t>
       </w:r>
       <w:r>
         <w:t>,</w:t>
@@ -5136,10 +5144,7 @@
         <w:t>short codes</w:t>
       </w:r>
       <w:r>
-        <w:t>. Otherwise,</w:t>
-      </w:r>
-      <w:r>
-        <w:t xml:space="preserve"> you don’t see any payment methods on checkout page.</w:t>
+        <w:t>. Otherwise, you don’t see any payment methods on checkout page.</w:t>
       </w:r>
     </w:p>
     <w:p>
@@ -5151,83 +5156,74 @@
       <w:pPr>
         <w:pStyle w:val="Heading2"/>
       </w:pPr>
-      <w:bookmarkStart w:id="71" w:name="_Toc11353203"/>
-      <w:bookmarkStart w:id="72" w:name="_Toc11353129"/>
-      <w:bookmarkStart w:id="73" w:name="_Toc11253830"/>
-      <w:bookmarkStart w:id="74" w:name="_Toc11144783"/>
-      <w:bookmarkStart w:id="75" w:name="_Toc10743694"/>
-      <w:bookmarkStart w:id="76" w:name="_Toc10741274"/>
-      <w:bookmarkStart w:id="77" w:name="_Toc10646648"/>
-      <w:bookmarkStart w:id="78" w:name="_Ref216539626"/>
-      <w:bookmarkStart w:id="79" w:name="_Toc216540516"/>
+      <w:bookmarkStart w:id="71" w:name="_Ref216539626"/>
+      <w:bookmarkStart w:id="72" w:name="_Toc216540516"/>
+      <w:bookmarkStart w:id="73" w:name="_Toc11353203"/>
+      <w:bookmarkStart w:id="74" w:name="_Toc11353129"/>
+      <w:bookmarkStart w:id="75" w:name="_Toc11253830"/>
+      <w:bookmarkStart w:id="76" w:name="_Toc11144783"/>
+      <w:bookmarkStart w:id="77" w:name="_Toc10743694"/>
+      <w:bookmarkStart w:id="78" w:name="_Toc10741274"/>
+      <w:bookmarkStart w:id="79" w:name="_Toc10646648"/>
       <w:r>
         <w:lastRenderedPageBreak/>
         <w:t>Redirect to Svea’s Payment Method Selection Page</w:t>
       </w:r>
-      <w:bookmarkEnd w:id="78"/>
-      <w:bookmarkEnd w:id="79"/>
-    </w:p>
-    <w:p>
-      <w:pPr>
-        <w:pStyle w:val="Textbody"/>
-      </w:pPr>
-      <w:r>
-        <w:t>Use this option, if you want to use the payment method selection page on the Svea Payment’s web pages instead of WooCommerce Checkout payment selection on the checkout page.</w:t>
-      </w:r>
-    </w:p>
-    <w:p>
-      <w:pPr>
-        <w:pStyle w:val="Textbody"/>
-      </w:pPr>
-      <w:r>
-        <w:t>See</w:t>
-      </w:r>
-      <w:r>
-        <w:t xml:space="preserve"> Chapter</w:t>
-      </w:r>
-      <w:r>
-        <w:t xml:space="preserve"> </w:t>
-      </w:r>
-      <w:r>
-        <w:fldChar w:fldCharType="begin"/>
-      </w:r>
-      <w:r>
-        <w:instrText xml:space="preserve"> REF _Ref216538941 \r \h </w:instrText>
-      </w:r>
-      <w:r>
-        <w:fldChar w:fldCharType="separate"/>
-      </w:r>
-      <w:r>
-        <w:t>6.1</w:t>
-      </w:r>
-      <w:r>
-        <w:fldChar w:fldCharType="end"/>
-      </w:r>
-      <w:r>
-        <w:t xml:space="preserve"> </w:t>
-      </w:r>
-      <w:r>
-        <w:t>for more.</w:t>
-      </w:r>
-    </w:p>
-    <w:p>
-      <w:pPr>
-        <w:pStyle w:val="Heading2"/>
-      </w:pPr>
-      <w:bookmarkStart w:id="80" w:name="_Toc216540517"/>
-      <w:r>
-        <w:t xml:space="preserve">Redirect to Svea’s Payment Method </w:t>
-      </w:r>
-      <w:r>
-        <w:t>Title</w:t>
-      </w:r>
       <w:bookmarkEnd w:id="71"/>
       <w:bookmarkEnd w:id="72"/>
+    </w:p>
+    <w:p>
+      <w:pPr>
+        <w:pStyle w:val="Textbody"/>
+      </w:pPr>
+      <w:r>
+        <w:t>Use this option, if you want to use the payment method selection page on the Svea Payment’s web pages instead of WooCommerce Checkout payment selection on the checkout page.</w:t>
+      </w:r>
+    </w:p>
+    <w:p>
+      <w:pPr>
+        <w:pStyle w:val="Textbody"/>
+      </w:pPr>
+      <w:r>
+        <w:t xml:space="preserve">See Chapter </w:t>
+      </w:r>
+      <w:r>
+        <w:fldChar w:fldCharType="begin"/>
+      </w:r>
+      <w:r>
+        <w:instrText xml:space="preserve"> REF _Ref216538941 \r \h </w:instrText>
+      </w:r>
+      <w:r>
+        <w:fldChar w:fldCharType="separate"/>
+      </w:r>
+      <w:r>
+        <w:t>6.1</w:t>
+      </w:r>
+      <w:r>
+        <w:fldChar w:fldCharType="end"/>
+      </w:r>
+      <w:r>
+        <w:t xml:space="preserve"> for more.</w:t>
+      </w:r>
+    </w:p>
+    <w:p>
+      <w:pPr>
+        <w:pStyle w:val="Heading2"/>
+      </w:pPr>
+      <w:bookmarkStart w:id="80" w:name="_Toc216540517"/>
+      <w:r>
+        <w:t xml:space="preserve">Redirect to Svea’s Payment Method </w:t>
+      </w:r>
+      <w:r>
+        <w:t>Title</w:t>
+      </w:r>
       <w:bookmarkEnd w:id="73"/>
       <w:bookmarkEnd w:id="74"/>
       <w:bookmarkEnd w:id="75"/>
       <w:bookmarkEnd w:id="76"/>
       <w:bookmarkEnd w:id="77"/>
+      <w:bookmarkEnd w:id="78"/>
+      <w:bookmarkEnd w:id="79"/>
       <w:bookmarkEnd w:id="80"/>
     </w:p>
     <w:p>
@@ -5286,18 +5282,18 @@
       <w:pPr>
         <w:pStyle w:val="Heading2"/>
       </w:pPr>
-      <w:bookmarkStart w:id="89" w:name="_Toc11353205"/>
-      <w:bookmarkStart w:id="90" w:name="_Toc11353131"/>
-      <w:bookmarkStart w:id="91" w:name="_Toc11253832"/>
-      <w:bookmarkStart w:id="92" w:name="_Toc11144785"/>
-      <w:bookmarkStart w:id="93" w:name="_Toc10743696"/>
-      <w:bookmarkStart w:id="94" w:name="_Toc10741276"/>
-      <w:bookmarkStart w:id="95" w:name="_Toc10646650"/>
-      <w:bookmarkStart w:id="96" w:name="_Toc216540519"/>
+      <w:bookmarkStart w:id="89" w:name="_Toc216540519"/>
+      <w:bookmarkStart w:id="90" w:name="_Toc11353205"/>
+      <w:bookmarkStart w:id="91" w:name="_Toc11353131"/>
+      <w:bookmarkStart w:id="92" w:name="_Toc11253832"/>
+      <w:bookmarkStart w:id="93" w:name="_Toc11144785"/>
+      <w:bookmarkStart w:id="94" w:name="_Toc10743696"/>
+      <w:bookmarkStart w:id="95" w:name="_Toc10741276"/>
+      <w:bookmarkStart w:id="96" w:name="_Toc10646650"/>
       <w:r>
         <w:t>Payment handling fees</w:t>
       </w:r>
-      <w:bookmarkEnd w:id="96"/>
+      <w:bookmarkEnd w:id="89"/>
     </w:p>
     <w:p>
       <w:pPr>
@@ -5445,13 +5441,13 @@
       <w:r>
         <w:t>d</w:t>
       </w:r>
-      <w:bookmarkEnd w:id="89"/>
       <w:bookmarkEnd w:id="90"/>
       <w:bookmarkEnd w:id="91"/>
       <w:bookmarkEnd w:id="92"/>
       <w:bookmarkEnd w:id="93"/>
       <w:bookmarkEnd w:id="94"/>
       <w:bookmarkEnd w:id="95"/>
+      <w:bookmarkEnd w:id="96"/>
       <w:r>
         <w:t xml:space="preserve">, </w:t>
       </w:r>
@@ -5825,6 +5821,9 @@
         <w:br/>
       </w:r>
       <w:r>
+        <w:rPr>
+          <w:noProof/>
+        </w:rPr>
         <w:drawing>
           <wp:inline distT="0" distB="0" distL="0" distR="0" wp14:anchorId="5685F1C4" wp14:editId="6FCEC380">
             <wp:extent cx="3730028" cy="2747118"/>
@@ -6276,6 +6275,9 @@
         <w:pStyle w:val="Textbody"/>
       </w:pPr>
       <w:r>
+        <w:rPr>
+          <w:noProof/>
+        </w:rPr>
         <w:lastRenderedPageBreak/>
         <w:drawing>
           <wp:inline distT="0" distB="0" distL="0" distR="0" wp14:anchorId="6D1C2B98" wp14:editId="6827D049">
@@ -6327,6 +6329,9 @@
         <w:pStyle w:val="Textbody"/>
       </w:pPr>
       <w:r>
+        <w:rPr>
+          <w:noProof/>
+        </w:rPr>
         <w:drawing>
           <wp:inline distT="0" distB="0" distL="0" distR="0" wp14:anchorId="469457EC" wp14:editId="39CDE73A">
             <wp:extent cx="5021383" cy="4300396"/>
@@ -6642,6 +6647,9 @@
         <w:br/>
       </w:r>
       <w:r>
+        <w:rPr>
+          <w:noProof/>
+        </w:rPr>
         <w:drawing>
           <wp:inline distT="0" distB="0" distL="0" distR="0" wp14:anchorId="14D49CDF" wp14:editId="1212367F">
             <wp:extent cx="6120765" cy="3067685"/>
@@ -8515,7 +8523,7 @@
         <w:sz w:val="20"/>
         <w:szCs w:val="20"/>
       </w:rPr>
-      <w:t>13</w:t>
+      <w:t>1</w:t>
     </w:r>
     <w:r>
       <w:rPr>
@@ -8531,7 +8539,7 @@
         <w:sz w:val="20"/>
         <w:szCs w:val="20"/>
       </w:rPr>
-      <w:t>12</w:t>
+      <w:t>3</w:t>
     </w:r>
     <w:r>
       <w:rPr>
@@ -8555,7 +8563,7 @@
         <w:sz w:val="20"/>
         <w:szCs w:val="20"/>
       </w:rPr>
-      <w:t>5</w:t>
+      <w:t>6</w:t>
     </w:r>
   </w:p>
 </w:hdr>

</xml_diff>

<commit_message>
YITH gift cards support (#109)
* YITH gift card support
* Updated documentation
</commit_message>
<xml_diff>
--- a/docs/Svea_Payment_Gateway_Manual.docx
+++ b/docs/Svea_Payment_Gateway_Manual.docx
@@ -1,6 +1,6 @@
 
 <file path=word/document.xml><?xml version="1.0" encoding="utf-8"?>
-<w:document xmlns:wpc="http://schemas.microsoft.com/office/word/2010/wordprocessingCanvas" xmlns:cx="http://schemas.microsoft.com/office/drawing/2014/chartex" xmlns:cx1="http://schemas.microsoft.com/office/drawing/2015/9/8/chartex" xmlns:cx2="http://schemas.microsoft.com/office/drawing/2015/10/21/chartex" xmlns:cx3="http://schemas.microsoft.com/office/drawing/2016/5/9/chartex" xmlns:cx4="http://schemas.microsoft.com/office/drawing/2016/5/10/chartex" xmlns:cx5="http://schemas.microsoft.com/office/drawing/2016/5/11/chartex" xmlns:cx6="http://schemas.microsoft.com/office/drawing/2016/5/12/chartex" xmlns:cx7="http://schemas.microsoft.com/office/drawing/2016/5/13/chartex" xmlns:cx8="http://schemas.microsoft.com/office/drawing/2016/5/14/chartex" xmlns:mc="http://schemas.openxmlformats.org/markup-compatibility/2006" xmlns:aink="http://schemas.microsoft.com/office/drawing/2016/ink" xmlns:am3d="http://schemas.microsoft.com/office/drawing/2017/model3d" xmlns:o="urn:schemas-microsoft-com:office:office" xmlns:oel="http://schemas.microsoft.com/office/2019/extlst" xmlns:r="http://schemas.openxmlformats.org/officeDocument/2006/relationships" xmlns:m="http://schemas.openxmlformats.org/officeDocument/2006/math" xmlns:v="urn:schemas-microsoft-com:vml" xmlns:wp14="http://schemas.microsoft.com/office/word/2010/wordprocessingDrawing" xmlns:wp="http://schemas.openxmlformats.org/drawingml/2006/wordprocessingDrawing" xmlns:w10="urn:schemas-microsoft-com:office:word" xmlns:w="http://schemas.openxmlformats.org/wordprocessingml/2006/main" xmlns:w14="http://schemas.microsoft.com/office/word/2010/wordml" xmlns:w15="http://schemas.microsoft.com/office/word/2012/wordml" xmlns:w16cex="http://schemas.microsoft.com/office/word/2018/wordml/cex" xmlns:w16cid="http://schemas.microsoft.com/office/word/2016/wordml/cid" xmlns:w16="http://schemas.microsoft.com/office/word/2018/wordml" xmlns:w16du="http://schemas.microsoft.com/office/word/2023/wordml/word16du" xmlns:w16sdtdh="http://schemas.microsoft.com/office/word/2020/wordml/sdtdatahash" xmlns:w16sdtfl="http://schemas.microsoft.com/office/word/2024/wordml/sdtformatlock" xmlns:w16se="http://schemas.microsoft.com/office/word/2015/wordml/symex" xmlns:wpg="http://schemas.microsoft.com/office/word/2010/wordprocessingGroup" xmlns:wpi="http://schemas.microsoft.com/office/word/2010/wordprocessingInk" xmlns:wne="http://schemas.microsoft.com/office/word/2006/wordml" xmlns:wps="http://schemas.microsoft.com/office/word/2010/wordprocessingShape" mc:Ignorable="w14 w15 w16se w16cid w16 w16cex w16sdtdh w16sdtfl w16du wp14">
+<w:document xmlns:wpc="http://schemas.microsoft.com/office/word/2010/wordprocessingCanvas" xmlns:cx="http://schemas.microsoft.com/office/drawing/2014/chartex" xmlns:cx1="http://schemas.microsoft.com/office/drawing/2015/9/8/chartex" xmlns:cx2="http://schemas.microsoft.com/office/drawing/2015/10/21/chartex" xmlns:cx3="http://schemas.microsoft.com/office/drawing/2016/5/9/chartex" xmlns:cx4="http://schemas.microsoft.com/office/drawing/2016/5/10/chartex" xmlns:cx5="http://schemas.microsoft.com/office/drawing/2016/5/11/chartex" xmlns:cx6="http://schemas.microsoft.com/office/drawing/2016/5/12/chartex" xmlns:cx7="http://schemas.microsoft.com/office/drawing/2016/5/13/chartex" xmlns:cx8="http://schemas.microsoft.com/office/drawing/2016/5/14/chartex" xmlns:mc="http://schemas.openxmlformats.org/markup-compatibility/2006" xmlns:m="http://schemas.openxmlformats.org/officeDocument/2006/math" xmlns:aink="http://schemas.microsoft.com/office/drawing/2016/ink" xmlns:am3d="http://schemas.microsoft.com/office/drawing/2017/model3d" xmlns:oel="http://schemas.microsoft.com/office/2019/extlst" xmlns:r="http://schemas.openxmlformats.org/officeDocument/2006/relationships" xmlns:wp14="http://schemas.microsoft.com/office/word/2010/wordprocessingDrawing" xmlns:wp="http://schemas.openxmlformats.org/drawingml/2006/wordprocessingDrawing" xmlns:wpg="http://schemas.microsoft.com/office/word/2010/wordprocessingGroup" xmlns:wpi="http://schemas.microsoft.com/office/word/2010/wordprocessingInk" xmlns:wps="http://schemas.microsoft.com/office/word/2010/wordprocessingShape" xmlns:o="urn:schemas-microsoft-com:office:office" xmlns:v="urn:schemas-microsoft-com:vml" xmlns:w10="urn:schemas-microsoft-com:office:word" xmlns:w="http://schemas.openxmlformats.org/wordprocessingml/2006/main" xmlns:w14="http://schemas.microsoft.com/office/word/2010/wordml" xmlns:w15="http://schemas.microsoft.com/office/word/2012/wordml" xmlns:w16cei="http://schemas.microsoft.com/office/word/2026/wordml/cei" xmlns:w16cex="http://schemas.microsoft.com/office/word/2018/wordml/cex" xmlns:w16cid="http://schemas.microsoft.com/office/word/2016/wordml/cid" xmlns:w16="http://schemas.microsoft.com/office/word/2018/wordml" xmlns:w16sdtdh="http://schemas.microsoft.com/office/word/2020/wordml/sdtdatahash" xmlns:w16sdtfl="http://schemas.microsoft.com/office/word/2024/wordml/sdtformatlock" xmlns:w16se="http://schemas.microsoft.com/office/word/2015/wordml/symex" xmlns:w16du="http://schemas.microsoft.com/office/word/2023/wordml/word16du" xmlns:wne="http://schemas.microsoft.com/office/word/2006/wordml" mc:Ignorable="w14 w15 w16se w16cid w16 w16cex w16sdtdh w16sdtfl w16du wp14">
   <w:body>
     <w:p>
       <w:pPr>
@@ -351,7 +351,7 @@
           <w:iCs/>
           <w:szCs w:val="22"/>
         </w:rPr>
-        <w:t>1</w:t>
+        <w:t>4</w:t>
       </w:r>
     </w:p>
     <w:p>
@@ -411,7 +411,7 @@
         </w:rPr>
         <w:fldChar w:fldCharType="separate"/>
       </w:r>
-      <w:hyperlink w:anchor="_Toc216540506" w:history="1">
+      <w:hyperlink w:anchor="_Toc235736382" w:history="1">
         <w:r>
           <w:rPr>
             <w:rStyle w:val="Hyperlink"/>
@@ -453,7 +453,7 @@
           <w:rPr>
             <w:noProof/>
           </w:rPr>
-          <w:instrText xml:space="preserve"> PAGEREF _Toc216540506 \h </w:instrText>
+          <w:instrText xml:space="preserve"> PAGEREF _Toc235736382 \h </w:instrText>
         </w:r>
         <w:r>
           <w:rPr>
@@ -496,7 +496,7 @@
           <w14:ligatures w14:val="standardContextual"/>
         </w:rPr>
       </w:pPr>
-      <w:hyperlink w:anchor="_Toc216540507" w:history="1">
+      <w:hyperlink w:anchor="_Toc235736383" w:history="1">
         <w:r>
           <w:rPr>
             <w:rStyle w:val="Hyperlink"/>
@@ -538,7 +538,7 @@
           <w:rPr>
             <w:noProof/>
           </w:rPr>
-          <w:instrText xml:space="preserve"> PAGEREF _Toc216540507 \h </w:instrText>
+          <w:instrText xml:space="preserve"> PAGEREF _Toc235736383 \h </w:instrText>
         </w:r>
         <w:r>
           <w:rPr>
@@ -581,7 +581,7 @@
           <w14:ligatures w14:val="standardContextual"/>
         </w:rPr>
       </w:pPr>
-      <w:hyperlink w:anchor="_Toc216540508" w:history="1">
+      <w:hyperlink w:anchor="_Toc235736384" w:history="1">
         <w:r>
           <w:rPr>
             <w:rStyle w:val="Hyperlink"/>
@@ -623,7 +623,7 @@
           <w:rPr>
             <w:noProof/>
           </w:rPr>
-          <w:instrText xml:space="preserve"> PAGEREF _Toc216540508 \h </w:instrText>
+          <w:instrText xml:space="preserve"> PAGEREF _Toc235736384 \h </w:instrText>
         </w:r>
         <w:r>
           <w:rPr>
@@ -666,7 +666,7 @@
           <w14:ligatures w14:val="standardContextual"/>
         </w:rPr>
       </w:pPr>
-      <w:hyperlink w:anchor="_Toc216540509" w:history="1">
+      <w:hyperlink w:anchor="_Toc235736385" w:history="1">
         <w:r>
           <w:rPr>
             <w:rStyle w:val="Hyperlink"/>
@@ -723,7 +723,7 @@
           <w:rPr>
             <w:noProof/>
           </w:rPr>
-          <w:instrText xml:space="preserve"> PAGEREF _Toc216540509 \h </w:instrText>
+          <w:instrText xml:space="preserve"> PAGEREF _Toc235736385 \h </w:instrText>
         </w:r>
         <w:r>
           <w:rPr>
@@ -766,7 +766,7 @@
           <w14:ligatures w14:val="standardContextual"/>
         </w:rPr>
       </w:pPr>
-      <w:hyperlink w:anchor="_Toc216540510" w:history="1">
+      <w:hyperlink w:anchor="_Toc235736386" w:history="1">
         <w:r>
           <w:rPr>
             <w:rStyle w:val="Hyperlink"/>
@@ -808,7 +808,7 @@
           <w:rPr>
             <w:noProof/>
           </w:rPr>
-          <w:instrText xml:space="preserve"> PAGEREF _Toc216540510 \h </w:instrText>
+          <w:instrText xml:space="preserve"> PAGEREF _Toc235736386 \h </w:instrText>
         </w:r>
         <w:r>
           <w:rPr>
@@ -851,7 +851,7 @@
           <w14:ligatures w14:val="standardContextual"/>
         </w:rPr>
       </w:pPr>
-      <w:hyperlink w:anchor="_Toc216540511" w:history="1">
+      <w:hyperlink w:anchor="_Toc235736387" w:history="1">
         <w:r>
           <w:rPr>
             <w:rStyle w:val="Hyperlink"/>
@@ -893,7 +893,7 @@
           <w:rPr>
             <w:noProof/>
           </w:rPr>
-          <w:instrText xml:space="preserve"> PAGEREF _Toc216540511 \h </w:instrText>
+          <w:instrText xml:space="preserve"> PAGEREF _Toc235736387 \h </w:instrText>
         </w:r>
         <w:r>
           <w:rPr>
@@ -936,7 +936,7 @@
           <w14:ligatures w14:val="standardContextual"/>
         </w:rPr>
       </w:pPr>
-      <w:hyperlink w:anchor="_Toc216540512" w:history="1">
+      <w:hyperlink w:anchor="_Toc235736388" w:history="1">
         <w:r>
           <w:rPr>
             <w:rStyle w:val="Hyperlink"/>
@@ -978,7 +978,7 @@
           <w:rPr>
             <w:noProof/>
           </w:rPr>
-          <w:instrText xml:space="preserve"> PAGEREF _Toc216540512 \h </w:instrText>
+          <w:instrText xml:space="preserve"> PAGEREF _Toc235736388 \h </w:instrText>
         </w:r>
         <w:r>
           <w:rPr>
@@ -1021,7 +1021,7 @@
           <w14:ligatures w14:val="standardContextual"/>
         </w:rPr>
       </w:pPr>
-      <w:hyperlink w:anchor="_Toc216540513" w:history="1">
+      <w:hyperlink w:anchor="_Toc235736389" w:history="1">
         <w:r>
           <w:rPr>
             <w:rStyle w:val="Hyperlink"/>
@@ -1063,7 +1063,7 @@
           <w:rPr>
             <w:noProof/>
           </w:rPr>
-          <w:instrText xml:space="preserve"> PAGEREF _Toc216540513 \h </w:instrText>
+          <w:instrText xml:space="preserve"> PAGEREF _Toc235736389 \h </w:instrText>
         </w:r>
         <w:r>
           <w:rPr>
@@ -1106,7 +1106,7 @@
           <w14:ligatures w14:val="standardContextual"/>
         </w:rPr>
       </w:pPr>
-      <w:hyperlink w:anchor="_Toc216540514" w:history="1">
+      <w:hyperlink w:anchor="_Toc235736390" w:history="1">
         <w:r>
           <w:rPr>
             <w:rStyle w:val="Hyperlink"/>
@@ -1148,7 +1148,7 @@
           <w:rPr>
             <w:noProof/>
           </w:rPr>
-          <w:instrText xml:space="preserve"> PAGEREF _Toc216540514 \h </w:instrText>
+          <w:instrText xml:space="preserve"> PAGEREF _Toc235736390 \h </w:instrText>
         </w:r>
         <w:r>
           <w:rPr>
@@ -1191,7 +1191,7 @@
           <w14:ligatures w14:val="standardContextual"/>
         </w:rPr>
       </w:pPr>
-      <w:hyperlink w:anchor="_Toc216540515" w:history="1">
+      <w:hyperlink w:anchor="_Toc235736391" w:history="1">
         <w:r>
           <w:rPr>
             <w:rStyle w:val="Hyperlink"/>
@@ -1215,7 +1215,7 @@
             <w:rStyle w:val="Hyperlink"/>
             <w:noProof/>
           </w:rPr>
-          <w:t>Enable Block mode</w:t>
+          <w:t>Enable Block mode support</w:t>
         </w:r>
         <w:r>
           <w:rPr>
@@ -1233,7 +1233,7 @@
           <w:rPr>
             <w:noProof/>
           </w:rPr>
-          <w:instrText xml:space="preserve"> PAGEREF _Toc216540515 \h </w:instrText>
+          <w:instrText xml:space="preserve"> PAGEREF _Toc235736391 \h </w:instrText>
         </w:r>
         <w:r>
           <w:rPr>
@@ -1276,7 +1276,7 @@
           <w14:ligatures w14:val="standardContextual"/>
         </w:rPr>
       </w:pPr>
-      <w:hyperlink w:anchor="_Toc216540516" w:history="1">
+      <w:hyperlink w:anchor="_Toc235736392" w:history="1">
         <w:r>
           <w:rPr>
             <w:rStyle w:val="Hyperlink"/>
@@ -1318,7 +1318,7 @@
           <w:rPr>
             <w:noProof/>
           </w:rPr>
-          <w:instrText xml:space="preserve"> PAGEREF _Toc216540516 \h </w:instrText>
+          <w:instrText xml:space="preserve"> PAGEREF _Toc235736392 \h </w:instrText>
         </w:r>
         <w:r>
           <w:rPr>
@@ -1361,7 +1361,7 @@
           <w14:ligatures w14:val="standardContextual"/>
         </w:rPr>
       </w:pPr>
-      <w:hyperlink w:anchor="_Toc216540517" w:history="1">
+      <w:hyperlink w:anchor="_Toc235736393" w:history="1">
         <w:r>
           <w:rPr>
             <w:rStyle w:val="Hyperlink"/>
@@ -1403,7 +1403,7 @@
           <w:rPr>
             <w:noProof/>
           </w:rPr>
-          <w:instrText xml:space="preserve"> PAGEREF _Toc216540517 \h </w:instrText>
+          <w:instrText xml:space="preserve"> PAGEREF _Toc235736393 \h </w:instrText>
         </w:r>
         <w:r>
           <w:rPr>
@@ -1446,7 +1446,7 @@
           <w14:ligatures w14:val="standardContextual"/>
         </w:rPr>
       </w:pPr>
-      <w:hyperlink w:anchor="_Toc216540518" w:history="1">
+      <w:hyperlink w:anchor="_Toc235736394" w:history="1">
         <w:r>
           <w:rPr>
             <w:rStyle w:val="Hyperlink"/>
@@ -1488,7 +1488,7 @@
           <w:rPr>
             <w:noProof/>
           </w:rPr>
-          <w:instrText xml:space="preserve"> PAGEREF _Toc216540518 \h </w:instrText>
+          <w:instrText xml:space="preserve"> PAGEREF _Toc235736394 \h </w:instrText>
         </w:r>
         <w:r>
           <w:rPr>
@@ -1531,7 +1531,7 @@
           <w14:ligatures w14:val="standardContextual"/>
         </w:rPr>
       </w:pPr>
-      <w:hyperlink w:anchor="_Toc216540519" w:history="1">
+      <w:hyperlink w:anchor="_Toc235736395" w:history="1">
         <w:r>
           <w:rPr>
             <w:rStyle w:val="Hyperlink"/>
@@ -1573,7 +1573,7 @@
           <w:rPr>
             <w:noProof/>
           </w:rPr>
-          <w:instrText xml:space="preserve"> PAGEREF _Toc216540519 \h </w:instrText>
+          <w:instrText xml:space="preserve"> PAGEREF _Toc235736395 \h </w:instrText>
         </w:r>
         <w:r>
           <w:rPr>
@@ -1616,7 +1616,7 @@
           <w14:ligatures w14:val="standardContextual"/>
         </w:rPr>
       </w:pPr>
-      <w:hyperlink w:anchor="_Toc216540520" w:history="1">
+      <w:hyperlink w:anchor="_Toc235736396" w:history="1">
         <w:r>
           <w:rPr>
             <w:rStyle w:val="Hyperlink"/>
@@ -1658,7 +1658,7 @@
           <w:rPr>
             <w:noProof/>
           </w:rPr>
-          <w:instrText xml:space="preserve"> PAGEREF _Toc216540520 \h </w:instrText>
+          <w:instrText xml:space="preserve"> PAGEREF _Toc235736396 \h </w:instrText>
         </w:r>
         <w:r>
           <w:rPr>
@@ -1701,7 +1701,7 @@
           <w14:ligatures w14:val="standardContextual"/>
         </w:rPr>
       </w:pPr>
-      <w:hyperlink w:anchor="_Toc216540521" w:history="1">
+      <w:hyperlink w:anchor="_Toc235736397" w:history="1">
         <w:r>
           <w:rPr>
             <w:rStyle w:val="Hyperlink"/>
@@ -1743,7 +1743,7 @@
           <w:rPr>
             <w:noProof/>
           </w:rPr>
-          <w:instrText xml:space="preserve"> PAGEREF _Toc216540521 \h </w:instrText>
+          <w:instrText xml:space="preserve"> PAGEREF _Toc235736397 \h </w:instrText>
         </w:r>
         <w:r>
           <w:rPr>
@@ -1786,7 +1786,7 @@
           <w14:ligatures w14:val="standardContextual"/>
         </w:rPr>
       </w:pPr>
-      <w:hyperlink w:anchor="_Toc216540522" w:history="1">
+      <w:hyperlink w:anchor="_Toc235736398" w:history="1">
         <w:r>
           <w:rPr>
             <w:rStyle w:val="Hyperlink"/>
@@ -1828,7 +1828,7 @@
           <w:rPr>
             <w:noProof/>
           </w:rPr>
-          <w:instrText xml:space="preserve"> PAGEREF _Toc216540522 \h </w:instrText>
+          <w:instrText xml:space="preserve"> PAGEREF _Toc235736398 \h </w:instrText>
         </w:r>
         <w:r>
           <w:rPr>
@@ -1871,7 +1871,7 @@
           <w14:ligatures w14:val="standardContextual"/>
         </w:rPr>
       </w:pPr>
-      <w:hyperlink w:anchor="_Toc216540523" w:history="1">
+      <w:hyperlink w:anchor="_Toc235736399" w:history="1">
         <w:r>
           <w:rPr>
             <w:rStyle w:val="Hyperlink"/>
@@ -1913,7 +1913,7 @@
           <w:rPr>
             <w:noProof/>
           </w:rPr>
-          <w:instrText xml:space="preserve"> PAGEREF _Toc216540523 \h </w:instrText>
+          <w:instrText xml:space="preserve"> PAGEREF _Toc235736399 \h </w:instrText>
         </w:r>
         <w:r>
           <w:rPr>
@@ -1956,7 +1956,7 @@
           <w14:ligatures w14:val="standardContextual"/>
         </w:rPr>
       </w:pPr>
-      <w:hyperlink w:anchor="_Toc216540524" w:history="1">
+      <w:hyperlink w:anchor="_Toc235736400" w:history="1">
         <w:r>
           <w:rPr>
             <w:rStyle w:val="Hyperlink"/>
@@ -1998,7 +1998,7 @@
           <w:rPr>
             <w:noProof/>
           </w:rPr>
-          <w:instrText xml:space="preserve"> PAGEREF _Toc216540524 \h </w:instrText>
+          <w:instrText xml:space="preserve"> PAGEREF _Toc235736400 \h </w:instrText>
         </w:r>
         <w:r>
           <w:rPr>
@@ -2041,7 +2041,7 @@
           <w14:ligatures w14:val="standardContextual"/>
         </w:rPr>
       </w:pPr>
-      <w:hyperlink w:anchor="_Toc216540525" w:history="1">
+      <w:hyperlink w:anchor="_Toc235736401" w:history="1">
         <w:r>
           <w:rPr>
             <w:rStyle w:val="Hyperlink"/>
@@ -2083,7 +2083,7 @@
           <w:rPr>
             <w:noProof/>
           </w:rPr>
-          <w:instrText xml:space="preserve"> PAGEREF _Toc216540525 \h </w:instrText>
+          <w:instrText xml:space="preserve"> PAGEREF _Toc235736401 \h </w:instrText>
         </w:r>
         <w:r>
           <w:rPr>
@@ -2126,7 +2126,7 @@
           <w14:ligatures w14:val="standardContextual"/>
         </w:rPr>
       </w:pPr>
-      <w:hyperlink w:anchor="_Toc216540526" w:history="1">
+      <w:hyperlink w:anchor="_Toc235736402" w:history="1">
         <w:r>
           <w:rPr>
             <w:rStyle w:val="Hyperlink"/>
@@ -2168,7 +2168,7 @@
           <w:rPr>
             <w:noProof/>
           </w:rPr>
-          <w:instrText xml:space="preserve"> PAGEREF _Toc216540526 \h </w:instrText>
+          <w:instrText xml:space="preserve"> PAGEREF _Toc235736402 \h </w:instrText>
         </w:r>
         <w:r>
           <w:rPr>
@@ -2211,7 +2211,7 @@
           <w14:ligatures w14:val="standardContextual"/>
         </w:rPr>
       </w:pPr>
-      <w:hyperlink w:anchor="_Toc216540527" w:history="1">
+      <w:hyperlink w:anchor="_Toc235736403" w:history="1">
         <w:r>
           <w:rPr>
             <w:rStyle w:val="Hyperlink"/>
@@ -2253,7 +2253,7 @@
           <w:rPr>
             <w:noProof/>
           </w:rPr>
-          <w:instrText xml:space="preserve"> PAGEREF _Toc216540527 \h </w:instrText>
+          <w:instrText xml:space="preserve"> PAGEREF _Toc235736403 \h </w:instrText>
         </w:r>
         <w:r>
           <w:rPr>
@@ -2296,7 +2296,7 @@
           <w14:ligatures w14:val="standardContextual"/>
         </w:rPr>
       </w:pPr>
-      <w:hyperlink w:anchor="_Toc216540528" w:history="1">
+      <w:hyperlink w:anchor="_Toc235736404" w:history="1">
         <w:r>
           <w:rPr>
             <w:rStyle w:val="Hyperlink"/>
@@ -2338,7 +2338,7 @@
           <w:rPr>
             <w:noProof/>
           </w:rPr>
-          <w:instrText xml:space="preserve"> PAGEREF _Toc216540528 \h </w:instrText>
+          <w:instrText xml:space="preserve"> PAGEREF _Toc235736404 \h </w:instrText>
         </w:r>
         <w:r>
           <w:rPr>
@@ -2381,7 +2381,7 @@
           <w14:ligatures w14:val="standardContextual"/>
         </w:rPr>
       </w:pPr>
-      <w:hyperlink w:anchor="_Toc216540529" w:history="1">
+      <w:hyperlink w:anchor="_Toc235736405" w:history="1">
         <w:r>
           <w:rPr>
             <w:rStyle w:val="Hyperlink"/>
@@ -2423,7 +2423,7 @@
           <w:rPr>
             <w:noProof/>
           </w:rPr>
-          <w:instrText xml:space="preserve"> PAGEREF _Toc216540529 \h </w:instrText>
+          <w:instrText xml:space="preserve"> PAGEREF _Toc235736405 \h </w:instrText>
         </w:r>
         <w:r>
           <w:rPr>
@@ -2466,7 +2466,7 @@
           <w14:ligatures w14:val="standardContextual"/>
         </w:rPr>
       </w:pPr>
-      <w:hyperlink w:anchor="_Toc216540530" w:history="1">
+      <w:hyperlink w:anchor="_Toc235736406" w:history="1">
         <w:r>
           <w:rPr>
             <w:rStyle w:val="Hyperlink"/>
@@ -2508,7 +2508,7 @@
           <w:rPr>
             <w:noProof/>
           </w:rPr>
-          <w:instrText xml:space="preserve"> PAGEREF _Toc216540530 \h </w:instrText>
+          <w:instrText xml:space="preserve"> PAGEREF _Toc235736406 \h </w:instrText>
         </w:r>
         <w:r>
           <w:rPr>
@@ -2551,7 +2551,7 @@
           <w14:ligatures w14:val="standardContextual"/>
         </w:rPr>
       </w:pPr>
-      <w:hyperlink w:anchor="_Toc216540531" w:history="1">
+      <w:hyperlink w:anchor="_Toc235736407" w:history="1">
         <w:r>
           <w:rPr>
             <w:rStyle w:val="Hyperlink"/>
@@ -2593,7 +2593,7 @@
           <w:rPr>
             <w:noProof/>
           </w:rPr>
-          <w:instrText xml:space="preserve"> PAGEREF _Toc216540531 \h </w:instrText>
+          <w:instrText xml:space="preserve"> PAGEREF _Toc235736407 \h </w:instrText>
         </w:r>
         <w:r>
           <w:rPr>
@@ -2636,7 +2636,7 @@
           <w14:ligatures w14:val="standardContextual"/>
         </w:rPr>
       </w:pPr>
-      <w:hyperlink w:anchor="_Toc216540532" w:history="1">
+      <w:hyperlink w:anchor="_Toc235736408" w:history="1">
         <w:r>
           <w:rPr>
             <w:rStyle w:val="Hyperlink"/>
@@ -2678,7 +2678,7 @@
           <w:rPr>
             <w:noProof/>
           </w:rPr>
-          <w:instrText xml:space="preserve"> PAGEREF _Toc216540532 \h </w:instrText>
+          <w:instrText xml:space="preserve"> PAGEREF _Toc235736408 \h </w:instrText>
         </w:r>
         <w:r>
           <w:rPr>
@@ -2721,7 +2721,7 @@
           <w14:ligatures w14:val="standardContextual"/>
         </w:rPr>
       </w:pPr>
-      <w:hyperlink w:anchor="_Toc216540533" w:history="1">
+      <w:hyperlink w:anchor="_Toc235736409" w:history="1">
         <w:r>
           <w:rPr>
             <w:rStyle w:val="Hyperlink"/>
@@ -2763,7 +2763,7 @@
           <w:rPr>
             <w:noProof/>
           </w:rPr>
-          <w:instrText xml:space="preserve"> PAGEREF _Toc216540533 \h </w:instrText>
+          <w:instrText xml:space="preserve"> PAGEREF _Toc235736409 \h </w:instrText>
         </w:r>
         <w:r>
           <w:rPr>
@@ -2806,7 +2806,7 @@
           <w14:ligatures w14:val="standardContextual"/>
         </w:rPr>
       </w:pPr>
-      <w:hyperlink w:anchor="_Toc216540534" w:history="1">
+      <w:hyperlink w:anchor="_Toc235736410" w:history="1">
         <w:r>
           <w:rPr>
             <w:rStyle w:val="Hyperlink"/>
@@ -2848,7 +2848,7 @@
           <w:rPr>
             <w:noProof/>
           </w:rPr>
-          <w:instrText xml:space="preserve"> PAGEREF _Toc216540534 \h </w:instrText>
+          <w:instrText xml:space="preserve"> PAGEREF _Toc235736410 \h </w:instrText>
         </w:r>
         <w:r>
           <w:rPr>
@@ -2891,7 +2891,7 @@
           <w14:ligatures w14:val="standardContextual"/>
         </w:rPr>
       </w:pPr>
-      <w:hyperlink w:anchor="_Toc216540535" w:history="1">
+      <w:hyperlink w:anchor="_Toc235736411" w:history="1">
         <w:r>
           <w:rPr>
             <w:rStyle w:val="Hyperlink"/>
@@ -2933,7 +2933,7 @@
           <w:rPr>
             <w:noProof/>
           </w:rPr>
-          <w:instrText xml:space="preserve"> PAGEREF _Toc216540535 \h </w:instrText>
+          <w:instrText xml:space="preserve"> PAGEREF _Toc235736411 \h </w:instrText>
         </w:r>
         <w:r>
           <w:rPr>
@@ -2976,7 +2976,7 @@
           <w14:ligatures w14:val="standardContextual"/>
         </w:rPr>
       </w:pPr>
-      <w:hyperlink w:anchor="_Toc216540536" w:history="1">
+      <w:hyperlink w:anchor="_Toc235736412" w:history="1">
         <w:r>
           <w:rPr>
             <w:rStyle w:val="Hyperlink"/>
@@ -3018,7 +3018,7 @@
           <w:rPr>
             <w:noProof/>
           </w:rPr>
-          <w:instrText xml:space="preserve"> PAGEREF _Toc216540536 \h </w:instrText>
+          <w:instrText xml:space="preserve"> PAGEREF _Toc235736412 \h </w:instrText>
         </w:r>
         <w:r>
           <w:rPr>
@@ -3061,7 +3061,7 @@
           <w14:ligatures w14:val="standardContextual"/>
         </w:rPr>
       </w:pPr>
-      <w:hyperlink w:anchor="_Toc216540537" w:history="1">
+      <w:hyperlink w:anchor="_Toc235736413" w:history="1">
         <w:r>
           <w:rPr>
             <w:rStyle w:val="Hyperlink"/>
@@ -3103,7 +3103,7 @@
           <w:rPr>
             <w:noProof/>
           </w:rPr>
-          <w:instrText xml:space="preserve"> PAGEREF _Toc216540537 \h </w:instrText>
+          <w:instrText xml:space="preserve"> PAGEREF _Toc235736413 \h </w:instrText>
         </w:r>
         <w:r>
           <w:rPr>
@@ -3146,7 +3146,7 @@
           <w14:ligatures w14:val="standardContextual"/>
         </w:rPr>
       </w:pPr>
-      <w:hyperlink w:anchor="_Toc216540538" w:history="1">
+      <w:hyperlink w:anchor="_Toc235736414" w:history="1">
         <w:r>
           <w:rPr>
             <w:rStyle w:val="Hyperlink"/>
@@ -3188,7 +3188,7 @@
           <w:rPr>
             <w:noProof/>
           </w:rPr>
-          <w:instrText xml:space="preserve"> PAGEREF _Toc216540538 \h </w:instrText>
+          <w:instrText xml:space="preserve"> PAGEREF _Toc235736414 \h </w:instrText>
         </w:r>
         <w:r>
           <w:rPr>
@@ -3231,7 +3231,7 @@
           <w14:ligatures w14:val="standardContextual"/>
         </w:rPr>
       </w:pPr>
-      <w:hyperlink w:anchor="_Toc216540539" w:history="1">
+      <w:hyperlink w:anchor="_Toc235736415" w:history="1">
         <w:r>
           <w:rPr>
             <w:rStyle w:val="Hyperlink"/>
@@ -3273,7 +3273,7 @@
           <w:rPr>
             <w:noProof/>
           </w:rPr>
-          <w:instrText xml:space="preserve"> PAGEREF _Toc216540539 \h </w:instrText>
+          <w:instrText xml:space="preserve"> PAGEREF _Toc235736415 \h </w:instrText>
         </w:r>
         <w:r>
           <w:rPr>
@@ -3324,7 +3324,7 @@
       <w:bookmarkStart w:id="5" w:name="_Toc10741265"/>
       <w:bookmarkStart w:id="6" w:name="_Toc10646639"/>
       <w:bookmarkStart w:id="7" w:name="__RefHeading__2268_1681451042"/>
-      <w:bookmarkStart w:id="8" w:name="_Toc216540506"/>
+      <w:bookmarkStart w:id="8" w:name="_Toc235736382"/>
       <w:r>
         <w:lastRenderedPageBreak/>
         <w:t xml:space="preserve">Version </w:t>
@@ -3416,7 +3416,7 @@
       <w:pPr>
         <w:pStyle w:val="Heading1"/>
       </w:pPr>
-      <w:bookmarkStart w:id="16" w:name="_Toc216540507"/>
+      <w:bookmarkStart w:id="16" w:name="_Toc235736383"/>
       <w:r>
         <w:t>Service requirements</w:t>
       </w:r>
@@ -3475,7 +3475,7 @@
       <w:bookmarkStart w:id="21" w:name="_Toc10743687"/>
       <w:bookmarkStart w:id="22" w:name="_Toc10741267"/>
       <w:bookmarkStart w:id="23" w:name="_Toc10646641"/>
-      <w:bookmarkStart w:id="24" w:name="_Toc216540508"/>
+      <w:bookmarkStart w:id="24" w:name="_Toc235736384"/>
       <w:r>
         <w:t>System requirements</w:t>
       </w:r>
@@ -3550,7 +3550,7 @@
         </w:tc>
         <w:tc>
           <w:tcPr>
-            <w:tcW w:w="5873" w:type="dxa"/>
+            <w:tcW w:w="5872" w:type="dxa"/>
             <w:tcBorders>
               <w:top w:val="single" w:sz="2" w:space="0" w:color="000000"/>
               <w:left w:val="single" w:sz="2" w:space="0" w:color="000000"/>
@@ -3612,7 +3612,7 @@
         </w:tc>
         <w:tc>
           <w:tcPr>
-            <w:tcW w:w="5873" w:type="dxa"/>
+            <w:tcW w:w="5872" w:type="dxa"/>
             <w:tcBorders>
               <w:left w:val="single" w:sz="2" w:space="0" w:color="000000"/>
               <w:bottom w:val="single" w:sz="2" w:space="0" w:color="000000"/>
@@ -3674,7 +3674,7 @@
         </w:tc>
         <w:tc>
           <w:tcPr>
-            <w:tcW w:w="5873" w:type="dxa"/>
+            <w:tcW w:w="5872" w:type="dxa"/>
             <w:tcBorders>
               <w:left w:val="single" w:sz="2" w:space="0" w:color="000000"/>
               <w:bottom w:val="single" w:sz="2" w:space="0" w:color="000000"/>
@@ -3733,7 +3733,7 @@
         </w:tc>
         <w:tc>
           <w:tcPr>
-            <w:tcW w:w="5873" w:type="dxa"/>
+            <w:tcW w:w="5872" w:type="dxa"/>
             <w:tcBorders>
               <w:left w:val="single" w:sz="2" w:space="0" w:color="000000"/>
               <w:bottom w:val="single" w:sz="2" w:space="0" w:color="000000"/>
@@ -3763,134 +3763,6 @@
           </w:p>
         </w:tc>
       </w:tr>
-      <w:tr>
-        <w:trPr>
-          <w:jc w:val="center"/>
-        </w:trPr>
-        <w:tc>
-          <w:tcPr>
-            <w:tcW w:w="2204" w:type="dxa"/>
-            <w:tcBorders>
-              <w:left w:val="single" w:sz="2" w:space="0" w:color="000000"/>
-              <w:bottom w:val="single" w:sz="2" w:space="0" w:color="000000"/>
-            </w:tcBorders>
-            <w:tcMar>
-              <w:top w:w="55" w:type="dxa"/>
-              <w:left w:w="55" w:type="dxa"/>
-              <w:bottom w:w="55" w:type="dxa"/>
-              <w:right w:w="55" w:type="dxa"/>
-            </w:tcMar>
-          </w:tcPr>
-          <w:p>
-            <w:pPr>
-              <w:pStyle w:val="TableContents"/>
-            </w:pPr>
-            <w:r>
-              <w:t xml:space="preserve">PHP </w:t>
-            </w:r>
-            <w:proofErr w:type="spellStart"/>
-            <w:r>
-              <w:t>cURL</w:t>
-            </w:r>
-            <w:proofErr w:type="spellEnd"/>
-            <w:r>
-              <w:t xml:space="preserve"> Module</w:t>
-            </w:r>
-          </w:p>
-        </w:tc>
-        <w:tc>
-          <w:tcPr>
-            <w:tcW w:w="5873" w:type="dxa"/>
-            <w:tcBorders>
-              <w:left w:val="single" w:sz="2" w:space="0" w:color="000000"/>
-              <w:bottom w:val="single" w:sz="2" w:space="0" w:color="000000"/>
-              <w:right w:val="single" w:sz="2" w:space="0" w:color="000000"/>
-            </w:tcBorders>
-            <w:tcMar>
-              <w:top w:w="55" w:type="dxa"/>
-              <w:left w:w="55" w:type="dxa"/>
-              <w:bottom w:w="55" w:type="dxa"/>
-              <w:right w:w="55" w:type="dxa"/>
-            </w:tcMar>
-          </w:tcPr>
-          <w:p>
-            <w:pPr>
-              <w:pStyle w:val="TableContents"/>
-              <w:numPr>
-                <w:ilvl w:val="0"/>
-                <w:numId w:val="14"/>
-              </w:numPr>
-            </w:pPr>
-            <w:r>
-              <w:t>Any</w:t>
-            </w:r>
-          </w:p>
-        </w:tc>
-      </w:tr>
-      <w:tr>
-        <w:trPr>
-          <w:jc w:val="center"/>
-        </w:trPr>
-        <w:tc>
-          <w:tcPr>
-            <w:tcW w:w="2204" w:type="dxa"/>
-            <w:tcBorders>
-              <w:left w:val="single" w:sz="2" w:space="0" w:color="000000"/>
-              <w:bottom w:val="single" w:sz="2" w:space="0" w:color="000000"/>
-            </w:tcBorders>
-            <w:tcMar>
-              <w:top w:w="55" w:type="dxa"/>
-              <w:left w:w="55" w:type="dxa"/>
-              <w:bottom w:w="55" w:type="dxa"/>
-              <w:right w:w="55" w:type="dxa"/>
-            </w:tcMar>
-          </w:tcPr>
-          <w:p>
-            <w:pPr>
-              <w:pStyle w:val="Standard"/>
-            </w:pPr>
-            <w:r>
-              <w:t xml:space="preserve">PHP </w:t>
-            </w:r>
-            <w:proofErr w:type="spellStart"/>
-            <w:r>
-              <w:t>mbstring</w:t>
-            </w:r>
-            <w:proofErr w:type="spellEnd"/>
-            <w:r>
-              <w:t xml:space="preserve"> module</w:t>
-            </w:r>
-          </w:p>
-        </w:tc>
-        <w:tc>
-          <w:tcPr>
-            <w:tcW w:w="5873" w:type="dxa"/>
-            <w:tcBorders>
-              <w:left w:val="single" w:sz="2" w:space="0" w:color="000000"/>
-              <w:bottom w:val="single" w:sz="2" w:space="0" w:color="000000"/>
-              <w:right w:val="single" w:sz="2" w:space="0" w:color="000000"/>
-            </w:tcBorders>
-            <w:tcMar>
-              <w:top w:w="55" w:type="dxa"/>
-              <w:left w:w="55" w:type="dxa"/>
-              <w:bottom w:w="55" w:type="dxa"/>
-              <w:right w:w="55" w:type="dxa"/>
-            </w:tcMar>
-          </w:tcPr>
-          <w:p>
-            <w:pPr>
-              <w:pStyle w:val="TableContents"/>
-              <w:numPr>
-                <w:ilvl w:val="0"/>
-                <w:numId w:val="14"/>
-              </w:numPr>
-            </w:pPr>
-            <w:r>
-              <w:t>Any</w:t>
-            </w:r>
-          </w:p>
-        </w:tc>
-      </w:tr>
     </w:tbl>
     <w:p>
       <w:pPr>
@@ -3951,7 +3823,7 @@
           <w:b/>
           <w:bCs/>
         </w:rPr>
-        <w:t>5.5</w:t>
+        <w:t>5.2</w:t>
       </w:r>
       <w:r>
         <w:rPr>
@@ -3973,7 +3845,7 @@
       <w:pPr>
         <w:pStyle w:val="Heading2"/>
       </w:pPr>
-      <w:bookmarkStart w:id="25" w:name="_Toc216540509"/>
+      <w:bookmarkStart w:id="25" w:name="_Toc235736385"/>
       <w:r>
         <w:t>Supported 3</w:t>
       </w:r>
@@ -4027,6 +3899,37 @@
       </w:pPr>
       <w:r>
         <w:t>WooCommerce Gift Cards</w:t>
+      </w:r>
+    </w:p>
+    <w:p>
+      <w:pPr>
+        <w:pStyle w:val="Textbody"/>
+        <w:numPr>
+          <w:ilvl w:val="0"/>
+          <w:numId w:val="22"/>
+        </w:numPr>
+      </w:pPr>
+      <w:r>
+        <w:rPr>
+          <w:rFonts w:ascii="Segoe UI" w:hAnsi="Segoe UI" w:cs="Segoe UI"/>
+          <w:color w:val="000000"/>
+          <w:sz w:val="21"/>
+          <w:szCs w:val="21"/>
+          <w:shd w:val="clear" w:color="auto" w:fill="FFFFFF"/>
+        </w:rPr>
+        <w:t>YITH WooCommerce Gift Cards</w:t>
+      </w:r>
+    </w:p>
+    <w:p>
+      <w:pPr>
+        <w:pStyle w:val="Textbody"/>
+        <w:numPr>
+          <w:ilvl w:val="0"/>
+          <w:numId w:val="22"/>
+        </w:numPr>
+      </w:pPr>
+      <w:r>
+        <w:t>WooCommerce Extra Shipping Options</w:t>
       </w:r>
     </w:p>
     <w:p>
@@ -4056,7 +3959,7 @@
       <w:bookmarkStart w:id="30" w:name="_Toc10743689"/>
       <w:bookmarkStart w:id="31" w:name="_Toc10741269"/>
       <w:bookmarkStart w:id="32" w:name="_Toc10646643"/>
-      <w:bookmarkStart w:id="33" w:name="_Toc216540510"/>
+      <w:bookmarkStart w:id="33" w:name="_Toc235736386"/>
       <w:r>
         <w:lastRenderedPageBreak/>
         <w:t>Installation</w:t>
@@ -4105,7 +4008,7 @@
       <w:bookmarkStart w:id="38" w:name="_Toc11253827"/>
       <w:bookmarkStart w:id="39" w:name="_Toc11353126"/>
       <w:bookmarkStart w:id="40" w:name="_Toc11353200"/>
-      <w:bookmarkStart w:id="41" w:name="_Toc216540511"/>
+      <w:bookmarkStart w:id="41" w:name="_Toc235736387"/>
       <w:r>
         <w:t xml:space="preserve">Installing the </w:t>
       </w:r>
@@ -4638,7 +4541,7 @@
       <w:bookmarkStart w:id="47" w:name="_Toc10741270"/>
       <w:bookmarkStart w:id="48" w:name="_Toc10646644"/>
       <w:bookmarkStart w:id="49" w:name="__RefHeading__1414_1801812706"/>
-      <w:bookmarkStart w:id="50" w:name="_Toc216540512"/>
+      <w:bookmarkStart w:id="50" w:name="_Toc235736388"/>
       <w:r>
         <w:lastRenderedPageBreak/>
         <w:t xml:space="preserve">Upgrading </w:t>
@@ -4829,7 +4732,7 @@
       <w:pPr>
         <w:pStyle w:val="Heading1"/>
       </w:pPr>
-      <w:bookmarkStart w:id="59" w:name="_Toc216540513"/>
+      <w:bookmarkStart w:id="59" w:name="_Toc235736389"/>
       <w:r>
         <w:lastRenderedPageBreak/>
         <w:t>Configuration</w:t>
@@ -5073,7 +4976,7 @@
       <w:bookmarkStart w:id="64" w:name="_Toc10743693"/>
       <w:bookmarkStart w:id="65" w:name="_Toc10741273"/>
       <w:bookmarkStart w:id="66" w:name="_Toc10646647"/>
-      <w:bookmarkStart w:id="67" w:name="_Toc216540514"/>
+      <w:bookmarkStart w:id="67" w:name="_Toc235736390"/>
       <w:r>
         <w:t>Enable / Disable</w:t>
       </w:r>
@@ -5100,16 +5003,16 @@
       </w:pPr>
       <w:bookmarkStart w:id="68" w:name="_Ref216538732"/>
       <w:bookmarkStart w:id="69" w:name="_Ref216539648"/>
-      <w:bookmarkStart w:id="70" w:name="_Toc216540515"/>
+      <w:bookmarkStart w:id="70" w:name="_Toc235736391"/>
       <w:r>
         <w:t>Enable Block mode</w:t>
       </w:r>
       <w:bookmarkEnd w:id="68"/>
       <w:bookmarkEnd w:id="69"/>
+      <w:r>
+        <w:t xml:space="preserve"> support</w:t>
+      </w:r>
       <w:bookmarkEnd w:id="70"/>
-      <w:r>
-        <w:t xml:space="preserve"> support</w:t>
-      </w:r>
     </w:p>
     <w:p>
       <w:pPr>
@@ -5157,73 +5060,73 @@
         <w:pStyle w:val="Heading2"/>
       </w:pPr>
       <w:bookmarkStart w:id="71" w:name="_Ref216539626"/>
-      <w:bookmarkStart w:id="72" w:name="_Toc216540516"/>
-      <w:bookmarkStart w:id="73" w:name="_Toc11353203"/>
-      <w:bookmarkStart w:id="74" w:name="_Toc11353129"/>
-      <w:bookmarkStart w:id="75" w:name="_Toc11253830"/>
-      <w:bookmarkStart w:id="76" w:name="_Toc11144783"/>
-      <w:bookmarkStart w:id="77" w:name="_Toc10743694"/>
-      <w:bookmarkStart w:id="78" w:name="_Toc10741274"/>
-      <w:bookmarkStart w:id="79" w:name="_Toc10646648"/>
+      <w:bookmarkStart w:id="72" w:name="_Toc11353203"/>
+      <w:bookmarkStart w:id="73" w:name="_Toc11353129"/>
+      <w:bookmarkStart w:id="74" w:name="_Toc11253830"/>
+      <w:bookmarkStart w:id="75" w:name="_Toc11144783"/>
+      <w:bookmarkStart w:id="76" w:name="_Toc10743694"/>
+      <w:bookmarkStart w:id="77" w:name="_Toc10741274"/>
+      <w:bookmarkStart w:id="78" w:name="_Toc10646648"/>
+      <w:bookmarkStart w:id="79" w:name="_Toc235736392"/>
       <w:r>
         <w:lastRenderedPageBreak/>
         <w:t>Redirect to Svea’s Payment Method Selection Page</w:t>
       </w:r>
       <w:bookmarkEnd w:id="71"/>
+      <w:bookmarkEnd w:id="79"/>
+    </w:p>
+    <w:p>
+      <w:pPr>
+        <w:pStyle w:val="Textbody"/>
+      </w:pPr>
+      <w:r>
+        <w:t>Use this option, if you want to use the payment method selection page on the Svea Payment’s web pages instead of WooCommerce Checkout payment selection on the checkout page.</w:t>
+      </w:r>
+    </w:p>
+    <w:p>
+      <w:pPr>
+        <w:pStyle w:val="Textbody"/>
+      </w:pPr>
+      <w:r>
+        <w:t xml:space="preserve">See Chapter </w:t>
+      </w:r>
+      <w:r>
+        <w:fldChar w:fldCharType="begin"/>
+      </w:r>
+      <w:r>
+        <w:instrText xml:space="preserve"> REF _Ref216538941 \r \h </w:instrText>
+      </w:r>
+      <w:r>
+        <w:fldChar w:fldCharType="separate"/>
+      </w:r>
+      <w:r>
+        <w:t>6.1</w:t>
+      </w:r>
+      <w:r>
+        <w:fldChar w:fldCharType="end"/>
+      </w:r>
+      <w:r>
+        <w:t xml:space="preserve"> for more.</w:t>
+      </w:r>
+    </w:p>
+    <w:p>
+      <w:pPr>
+        <w:pStyle w:val="Heading2"/>
+      </w:pPr>
+      <w:bookmarkStart w:id="80" w:name="_Toc235736393"/>
+      <w:r>
+        <w:t xml:space="preserve">Redirect to Svea’s Payment Method </w:t>
+      </w:r>
+      <w:r>
+        <w:t>Title</w:t>
+      </w:r>
       <w:bookmarkEnd w:id="72"/>
-    </w:p>
-    <w:p>
-      <w:pPr>
-        <w:pStyle w:val="Textbody"/>
-      </w:pPr>
-      <w:r>
-        <w:t>Use this option, if you want to use the payment method selection page on the Svea Payment’s web pages instead of WooCommerce Checkout payment selection on the checkout page.</w:t>
-      </w:r>
-    </w:p>
-    <w:p>
-      <w:pPr>
-        <w:pStyle w:val="Textbody"/>
-      </w:pPr>
-      <w:r>
-        <w:t xml:space="preserve">See Chapter </w:t>
-      </w:r>
-      <w:r>
-        <w:fldChar w:fldCharType="begin"/>
-      </w:r>
-      <w:r>
-        <w:instrText xml:space="preserve"> REF _Ref216538941 \r \h </w:instrText>
-      </w:r>
-      <w:r>
-        <w:fldChar w:fldCharType="separate"/>
-      </w:r>
-      <w:r>
-        <w:t>6.1</w:t>
-      </w:r>
-      <w:r>
-        <w:fldChar w:fldCharType="end"/>
-      </w:r>
-      <w:r>
-        <w:t xml:space="preserve"> for more.</w:t>
-      </w:r>
-    </w:p>
-    <w:p>
-      <w:pPr>
-        <w:pStyle w:val="Heading2"/>
-      </w:pPr>
-      <w:bookmarkStart w:id="80" w:name="_Toc216540517"/>
-      <w:r>
-        <w:t xml:space="preserve">Redirect to Svea’s Payment Method </w:t>
-      </w:r>
-      <w:r>
-        <w:t>Title</w:t>
-      </w:r>
       <w:bookmarkEnd w:id="73"/>
       <w:bookmarkEnd w:id="74"/>
       <w:bookmarkEnd w:id="75"/>
       <w:bookmarkEnd w:id="76"/>
       <w:bookmarkEnd w:id="77"/>
       <w:bookmarkEnd w:id="78"/>
-      <w:bookmarkEnd w:id="79"/>
       <w:bookmarkEnd w:id="80"/>
     </w:p>
     <w:p>
@@ -5257,7 +5160,7 @@
       <w:bookmarkStart w:id="85" w:name="_Toc10743695"/>
       <w:bookmarkStart w:id="86" w:name="_Toc10741275"/>
       <w:bookmarkStart w:id="87" w:name="_Toc10646649"/>
-      <w:bookmarkStart w:id="88" w:name="_Toc216540518"/>
+      <w:bookmarkStart w:id="88" w:name="_Toc235736394"/>
       <w:r>
         <w:t>Customer message</w:t>
       </w:r>
@@ -5282,18 +5185,18 @@
       <w:pPr>
         <w:pStyle w:val="Heading2"/>
       </w:pPr>
-      <w:bookmarkStart w:id="89" w:name="_Toc216540519"/>
-      <w:bookmarkStart w:id="90" w:name="_Toc11353205"/>
-      <w:bookmarkStart w:id="91" w:name="_Toc11353131"/>
-      <w:bookmarkStart w:id="92" w:name="_Toc11253832"/>
-      <w:bookmarkStart w:id="93" w:name="_Toc11144785"/>
-      <w:bookmarkStart w:id="94" w:name="_Toc10743696"/>
-      <w:bookmarkStart w:id="95" w:name="_Toc10741276"/>
-      <w:bookmarkStart w:id="96" w:name="_Toc10646650"/>
+      <w:bookmarkStart w:id="89" w:name="_Toc11353205"/>
+      <w:bookmarkStart w:id="90" w:name="_Toc11353131"/>
+      <w:bookmarkStart w:id="91" w:name="_Toc11253832"/>
+      <w:bookmarkStart w:id="92" w:name="_Toc11144785"/>
+      <w:bookmarkStart w:id="93" w:name="_Toc10743696"/>
+      <w:bookmarkStart w:id="94" w:name="_Toc10741276"/>
+      <w:bookmarkStart w:id="95" w:name="_Toc10646650"/>
+      <w:bookmarkStart w:id="96" w:name="_Toc235736395"/>
       <w:r>
         <w:t>Payment handling fees</w:t>
       </w:r>
-      <w:bookmarkEnd w:id="89"/>
+      <w:bookmarkEnd w:id="96"/>
     </w:p>
     <w:p>
       <w:pPr>
@@ -5332,7 +5235,7 @@
       <w:pPr>
         <w:pStyle w:val="Heading2"/>
       </w:pPr>
-      <w:bookmarkStart w:id="97" w:name="_Toc216540520"/>
+      <w:bookmarkStart w:id="97" w:name="_Toc235736396"/>
       <w:r>
         <w:t>Payment handling fee tax class</w:t>
       </w:r>
@@ -5357,7 +5260,7 @@
       <w:bookmarkStart w:id="102" w:name="_Toc10743698"/>
       <w:bookmarkStart w:id="103" w:name="_Toc10741278"/>
       <w:bookmarkStart w:id="104" w:name="_Toc10646652"/>
-      <w:bookmarkStart w:id="105" w:name="_Toc216540521"/>
+      <w:bookmarkStart w:id="105" w:name="_Toc235736397"/>
       <w:r>
         <w:t>Gateway</w:t>
       </w:r>
@@ -5431,7 +5334,7 @@
       <w:pPr>
         <w:pStyle w:val="Heading2"/>
       </w:pPr>
-      <w:bookmarkStart w:id="106" w:name="_Toc216540522"/>
+      <w:bookmarkStart w:id="106" w:name="_Toc235736398"/>
       <w:r>
         <w:t xml:space="preserve">Seller </w:t>
       </w:r>
@@ -5441,13 +5344,13 @@
       <w:r>
         <w:t>d</w:t>
       </w:r>
+      <w:bookmarkEnd w:id="89"/>
       <w:bookmarkEnd w:id="90"/>
       <w:bookmarkEnd w:id="91"/>
       <w:bookmarkEnd w:id="92"/>
       <w:bookmarkEnd w:id="93"/>
       <w:bookmarkEnd w:id="94"/>
       <w:bookmarkEnd w:id="95"/>
-      <w:bookmarkEnd w:id="96"/>
       <w:r>
         <w:t xml:space="preserve">, </w:t>
       </w:r>
@@ -5523,7 +5426,7 @@
       <w:bookmarkStart w:id="118" w:name="_Toc10743699"/>
       <w:bookmarkStart w:id="119" w:name="_Toc10741279"/>
       <w:bookmarkStart w:id="120" w:name="_Toc10646653"/>
-      <w:bookmarkStart w:id="121" w:name="_Toc216540523"/>
+      <w:bookmarkStart w:id="121" w:name="_Toc235736399"/>
       <w:r>
         <w:t>Payment</w:t>
       </w:r>
@@ -5574,7 +5477,7 @@
       <w:r>
         <w:t xml:space="preserve"> </w:t>
       </w:r>
-      <w:bookmarkStart w:id="122" w:name="_Toc216540524"/>
+      <w:bookmarkStart w:id="122" w:name="_Toc235736400"/>
       <w:r>
         <w:t xml:space="preserve">Send </w:t>
       </w:r>
@@ -5636,7 +5539,7 @@
       <w:pPr>
         <w:pStyle w:val="Heading2"/>
       </w:pPr>
-      <w:bookmarkStart w:id="123" w:name="_Toc216540525"/>
+      <w:bookmarkStart w:id="123" w:name="_Toc235736401"/>
       <w:r>
         <w:t>Send delivery confirmation only for specific payment methods</w:t>
       </w:r>
@@ -5726,7 +5629,7 @@
       <w:pPr>
         <w:pStyle w:val="Heading2"/>
       </w:pPr>
-      <w:bookmarkStart w:id="124" w:name="_Toc216540526"/>
+      <w:bookmarkStart w:id="124" w:name="_Toc235736402"/>
       <w:r>
         <w:lastRenderedPageBreak/>
         <w:t>Part Payment widget</w:t>
@@ -5925,7 +5828,7 @@
         <w:pStyle w:val="Heading1"/>
       </w:pPr>
       <w:bookmarkStart w:id="125" w:name="_Payment_method_views"/>
-      <w:bookmarkStart w:id="126" w:name="_Toc216540527"/>
+      <w:bookmarkStart w:id="126" w:name="_Toc235736403"/>
       <w:bookmarkEnd w:id="125"/>
       <w:r>
         <w:lastRenderedPageBreak/>
@@ -6091,7 +5994,7 @@
         <w:pStyle w:val="Heading2"/>
       </w:pPr>
       <w:bookmarkStart w:id="127" w:name="_Ref216538941"/>
-      <w:bookmarkStart w:id="128" w:name="_Toc216540528"/>
+      <w:bookmarkStart w:id="128" w:name="_Toc235736404"/>
       <w:r>
         <w:t>Redirect to Svea Payments</w:t>
       </w:r>
@@ -6157,7 +6060,7 @@
       <w:pPr>
         <w:pStyle w:val="Heading2"/>
       </w:pPr>
-      <w:bookmarkStart w:id="129" w:name="_Toc216540529"/>
+      <w:bookmarkStart w:id="129" w:name="_Toc235736405"/>
       <w:r>
         <w:t>Block mode theme view</w:t>
       </w:r>
@@ -6394,7 +6297,7 @@
       <w:pPr>
         <w:pStyle w:val="Heading2"/>
       </w:pPr>
-      <w:bookmarkStart w:id="130" w:name="_Toc216540530"/>
+      <w:bookmarkStart w:id="130" w:name="_Toc235736406"/>
       <w:r>
         <w:lastRenderedPageBreak/>
         <w:t>Collated payment method view</w:t>
@@ -6575,7 +6478,7 @@
       <w:pPr>
         <w:pStyle w:val="Heading2"/>
       </w:pPr>
-      <w:bookmarkStart w:id="138" w:name="_Toc216540531"/>
+      <w:bookmarkStart w:id="138" w:name="_Toc235736407"/>
       <w:r>
         <w:lastRenderedPageBreak/>
         <w:t>Separate payment methods</w:t>
@@ -6715,7 +6618,7 @@
       <w:pPr>
         <w:pStyle w:val="Heading1"/>
       </w:pPr>
-      <w:bookmarkStart w:id="139" w:name="_Toc216540532"/>
+      <w:bookmarkStart w:id="139" w:name="_Toc235736408"/>
       <w:r>
         <w:lastRenderedPageBreak/>
         <w:t>Language customization</w:t>
@@ -6802,7 +6705,7 @@
       <w:bookmarkStart w:id="145" w:name="_Toc10741283"/>
       <w:bookmarkStart w:id="146" w:name="_Toc10646657"/>
       <w:bookmarkStart w:id="147" w:name="__RefHeading__1978_1771778893"/>
-      <w:bookmarkStart w:id="148" w:name="_Toc216540533"/>
+      <w:bookmarkStart w:id="148" w:name="_Toc235736409"/>
       <w:r>
         <w:t>Testing the installation</w:t>
       </w:r>
@@ -6835,7 +6738,7 @@
       <w:bookmarkStart w:id="153" w:name="_Toc10743704"/>
       <w:bookmarkStart w:id="154" w:name="_Toc10741284"/>
       <w:bookmarkStart w:id="155" w:name="_Toc10646658"/>
-      <w:bookmarkStart w:id="156" w:name="_Toc216540534"/>
+      <w:bookmarkStart w:id="156" w:name="_Toc235736410"/>
       <w:r>
         <w:t>Testing in Svea Payments test environment</w:t>
       </w:r>
@@ -6938,7 +6841,7 @@
       <w:bookmarkStart w:id="161" w:name="_Toc10743706"/>
       <w:bookmarkStart w:id="162" w:name="_Toc10741286"/>
       <w:bookmarkStart w:id="163" w:name="_Toc10646660"/>
-      <w:bookmarkStart w:id="164" w:name="_Toc216540535"/>
+      <w:bookmarkStart w:id="164" w:name="_Toc235736411"/>
       <w:r>
         <w:lastRenderedPageBreak/>
         <w:t>Administration</w:t>
@@ -6984,7 +6887,7 @@
       <w:r>
         <w:t xml:space="preserve"> </w:t>
       </w:r>
-      <w:bookmarkStart w:id="166" w:name="_Toc216540536"/>
+      <w:bookmarkStart w:id="166" w:name="_Toc235736412"/>
       <w:r>
         <w:t>Payment verification</w:t>
       </w:r>
@@ -7021,7 +6924,7 @@
       <w:r>
         <w:t xml:space="preserve"> </w:t>
       </w:r>
-      <w:bookmarkStart w:id="174" w:name="_Toc216540537"/>
+      <w:bookmarkStart w:id="174" w:name="_Toc235736413"/>
       <w:r>
         <w:t>R</w:t>
       </w:r>
@@ -7119,7 +7022,7 @@
       <w:pPr>
         <w:pStyle w:val="Heading1"/>
       </w:pPr>
-      <w:bookmarkStart w:id="176" w:name="_Toc216540538"/>
+      <w:bookmarkStart w:id="176" w:name="_Toc235736414"/>
       <w:r>
         <w:lastRenderedPageBreak/>
         <w:t>About HPOS</w:t>
@@ -7355,7 +7258,7 @@
       <w:bookmarkStart w:id="182" w:name="_Toc11253824"/>
       <w:bookmarkStart w:id="183" w:name="_Toc11353123"/>
       <w:bookmarkStart w:id="184" w:name="_Toc11353197"/>
-      <w:bookmarkStart w:id="185" w:name="_Toc216540539"/>
+      <w:bookmarkStart w:id="185" w:name="_Toc235736415"/>
       <w:bookmarkEnd w:id="177"/>
       <w:r>
         <w:t>Package contents</w:t>
@@ -8034,7 +7937,7 @@
 </file>
 
 <file path=word/endnotes.xml><?xml version="1.0" encoding="utf-8"?>
-<w:endnotes xmlns:wpc="http://schemas.microsoft.com/office/word/2010/wordprocessingCanvas" xmlns:cx="http://schemas.microsoft.com/office/drawing/2014/chartex" xmlns:cx1="http://schemas.microsoft.com/office/drawing/2015/9/8/chartex" xmlns:cx2="http://schemas.microsoft.com/office/drawing/2015/10/21/chartex" xmlns:cx3="http://schemas.microsoft.com/office/drawing/2016/5/9/chartex" xmlns:cx4="http://schemas.microsoft.com/office/drawing/2016/5/10/chartex" xmlns:cx5="http://schemas.microsoft.com/office/drawing/2016/5/11/chartex" xmlns:cx6="http://schemas.microsoft.com/office/drawing/2016/5/12/chartex" xmlns:cx7="http://schemas.microsoft.com/office/drawing/2016/5/13/chartex" xmlns:cx8="http://schemas.microsoft.com/office/drawing/2016/5/14/chartex" xmlns:mc="http://schemas.openxmlformats.org/markup-compatibility/2006" xmlns:aink="http://schemas.microsoft.com/office/drawing/2016/ink" xmlns:am3d="http://schemas.microsoft.com/office/drawing/2017/model3d" xmlns:o="urn:schemas-microsoft-com:office:office" xmlns:oel="http://schemas.microsoft.com/office/2019/extlst" xmlns:r="http://schemas.openxmlformats.org/officeDocument/2006/relationships" xmlns:m="http://schemas.openxmlformats.org/officeDocument/2006/math" xmlns:v="urn:schemas-microsoft-com:vml" xmlns:wp14="http://schemas.microsoft.com/office/word/2010/wordprocessingDrawing" xmlns:wp="http://schemas.openxmlformats.org/drawingml/2006/wordprocessingDrawing" xmlns:w10="urn:schemas-microsoft-com:office:word" xmlns:w="http://schemas.openxmlformats.org/wordprocessingml/2006/main" xmlns:w14="http://schemas.microsoft.com/office/word/2010/wordml" xmlns:w15="http://schemas.microsoft.com/office/word/2012/wordml" xmlns:w16cex="http://schemas.microsoft.com/office/word/2018/wordml/cex" xmlns:w16cid="http://schemas.microsoft.com/office/word/2016/wordml/cid" xmlns:w16="http://schemas.microsoft.com/office/word/2018/wordml" xmlns:w16du="http://schemas.microsoft.com/office/word/2023/wordml/word16du" xmlns:w16sdtdh="http://schemas.microsoft.com/office/word/2020/wordml/sdtdatahash" xmlns:w16sdtfl="http://schemas.microsoft.com/office/word/2024/wordml/sdtformatlock" xmlns:w16se="http://schemas.microsoft.com/office/word/2015/wordml/symex" xmlns:wpg="http://schemas.microsoft.com/office/word/2010/wordprocessingGroup" xmlns:wpi="http://schemas.microsoft.com/office/word/2010/wordprocessingInk" xmlns:wne="http://schemas.microsoft.com/office/word/2006/wordml" xmlns:wps="http://schemas.microsoft.com/office/word/2010/wordprocessingShape" mc:Ignorable="w14 w15 w16se w16cid w16 w16cex w16sdtdh w16sdtfl w16du wp14">
+<w:endnotes xmlns:wpc="http://schemas.microsoft.com/office/word/2010/wordprocessingCanvas" xmlns:cx="http://schemas.microsoft.com/office/drawing/2014/chartex" xmlns:cx1="http://schemas.microsoft.com/office/drawing/2015/9/8/chartex" xmlns:cx2="http://schemas.microsoft.com/office/drawing/2015/10/21/chartex" xmlns:cx3="http://schemas.microsoft.com/office/drawing/2016/5/9/chartex" xmlns:cx4="http://schemas.microsoft.com/office/drawing/2016/5/10/chartex" xmlns:cx5="http://schemas.microsoft.com/office/drawing/2016/5/11/chartex" xmlns:cx6="http://schemas.microsoft.com/office/drawing/2016/5/12/chartex" xmlns:cx7="http://schemas.microsoft.com/office/drawing/2016/5/13/chartex" xmlns:cx8="http://schemas.microsoft.com/office/drawing/2016/5/14/chartex" xmlns:mc="http://schemas.openxmlformats.org/markup-compatibility/2006" xmlns:m="http://schemas.openxmlformats.org/officeDocument/2006/math" xmlns:aink="http://schemas.microsoft.com/office/drawing/2016/ink" xmlns:am3d="http://schemas.microsoft.com/office/drawing/2017/model3d" xmlns:oel="http://schemas.microsoft.com/office/2019/extlst" xmlns:r="http://schemas.openxmlformats.org/officeDocument/2006/relationships" xmlns:wp14="http://schemas.microsoft.com/office/word/2010/wordprocessingDrawing" xmlns:wp="http://schemas.openxmlformats.org/drawingml/2006/wordprocessingDrawing" xmlns:wpg="http://schemas.microsoft.com/office/word/2010/wordprocessingGroup" xmlns:wpi="http://schemas.microsoft.com/office/word/2010/wordprocessingInk" xmlns:wps="http://schemas.microsoft.com/office/word/2010/wordprocessingShape" xmlns:o="urn:schemas-microsoft-com:office:office" xmlns:v="urn:schemas-microsoft-com:vml" xmlns:w10="urn:schemas-microsoft-com:office:word" xmlns:w="http://schemas.openxmlformats.org/wordprocessingml/2006/main" xmlns:w14="http://schemas.microsoft.com/office/word/2010/wordml" xmlns:w15="http://schemas.microsoft.com/office/word/2012/wordml" xmlns:w16cei="http://schemas.microsoft.com/office/word/2026/wordml/cei" xmlns:w16cex="http://schemas.microsoft.com/office/word/2018/wordml/cex" xmlns:w16cid="http://schemas.microsoft.com/office/word/2016/wordml/cid" xmlns:w16="http://schemas.microsoft.com/office/word/2018/wordml" xmlns:w16sdtdh="http://schemas.microsoft.com/office/word/2020/wordml/sdtdatahash" xmlns:w16sdtfl="http://schemas.microsoft.com/office/word/2024/wordml/sdtformatlock" xmlns:w16se="http://schemas.microsoft.com/office/word/2015/wordml/symex" xmlns:w16du="http://schemas.microsoft.com/office/word/2023/wordml/word16du" xmlns:wne="http://schemas.microsoft.com/office/word/2006/wordml" mc:Ignorable="w14 w15 w16se w16cid w16 w16cex w16sdtdh w16sdtfl w16du wp14">
   <w:endnote w:type="separator" w:id="-1">
     <w:p>
       <w:r>
@@ -8053,7 +7956,7 @@
 </file>
 
 <file path=word/footer1.xml><?xml version="1.0" encoding="utf-8"?>
-<w:ftr xmlns:wpc="http://schemas.microsoft.com/office/word/2010/wordprocessingCanvas" xmlns:cx="http://schemas.microsoft.com/office/drawing/2014/chartex" xmlns:cx1="http://schemas.microsoft.com/office/drawing/2015/9/8/chartex" xmlns:cx2="http://schemas.microsoft.com/office/drawing/2015/10/21/chartex" xmlns:cx3="http://schemas.microsoft.com/office/drawing/2016/5/9/chartex" xmlns:cx4="http://schemas.microsoft.com/office/drawing/2016/5/10/chartex" xmlns:cx5="http://schemas.microsoft.com/office/drawing/2016/5/11/chartex" xmlns:cx6="http://schemas.microsoft.com/office/drawing/2016/5/12/chartex" xmlns:cx7="http://schemas.microsoft.com/office/drawing/2016/5/13/chartex" xmlns:cx8="http://schemas.microsoft.com/office/drawing/2016/5/14/chartex" xmlns:mc="http://schemas.openxmlformats.org/markup-compatibility/2006" xmlns:aink="http://schemas.microsoft.com/office/drawing/2016/ink" xmlns:am3d="http://schemas.microsoft.com/office/drawing/2017/model3d" xmlns:o="urn:schemas-microsoft-com:office:office" xmlns:oel="http://schemas.microsoft.com/office/2019/extlst" xmlns:r="http://schemas.openxmlformats.org/officeDocument/2006/relationships" xmlns:m="http://schemas.openxmlformats.org/officeDocument/2006/math" xmlns:v="urn:schemas-microsoft-com:vml" xmlns:wp14="http://schemas.microsoft.com/office/word/2010/wordprocessingDrawing" xmlns:wp="http://schemas.openxmlformats.org/drawingml/2006/wordprocessingDrawing" xmlns:w10="urn:schemas-microsoft-com:office:word" xmlns:w="http://schemas.openxmlformats.org/wordprocessingml/2006/main" xmlns:w14="http://schemas.microsoft.com/office/word/2010/wordml" xmlns:w15="http://schemas.microsoft.com/office/word/2012/wordml" xmlns:w16cex="http://schemas.microsoft.com/office/word/2018/wordml/cex" xmlns:w16cid="http://schemas.microsoft.com/office/word/2016/wordml/cid" xmlns:w16="http://schemas.microsoft.com/office/word/2018/wordml" xmlns:w16du="http://schemas.microsoft.com/office/word/2023/wordml/word16du" xmlns:w16sdtdh="http://schemas.microsoft.com/office/word/2020/wordml/sdtdatahash" xmlns:w16sdtfl="http://schemas.microsoft.com/office/word/2024/wordml/sdtformatlock" xmlns:w16se="http://schemas.microsoft.com/office/word/2015/wordml/symex" xmlns:wpg="http://schemas.microsoft.com/office/word/2010/wordprocessingGroup" xmlns:wpi="http://schemas.microsoft.com/office/word/2010/wordprocessingInk" xmlns:wne="http://schemas.microsoft.com/office/word/2006/wordml" xmlns:wps="http://schemas.microsoft.com/office/word/2010/wordprocessingShape" mc:Ignorable="w14 w15 w16se w16cid w16 w16cex w16sdtdh w16sdtfl w16du wp14">
+<w:ftr xmlns:wpc="http://schemas.microsoft.com/office/word/2010/wordprocessingCanvas" xmlns:cx="http://schemas.microsoft.com/office/drawing/2014/chartex" xmlns:cx1="http://schemas.microsoft.com/office/drawing/2015/9/8/chartex" xmlns:cx2="http://schemas.microsoft.com/office/drawing/2015/10/21/chartex" xmlns:cx3="http://schemas.microsoft.com/office/drawing/2016/5/9/chartex" xmlns:cx4="http://schemas.microsoft.com/office/drawing/2016/5/10/chartex" xmlns:cx5="http://schemas.microsoft.com/office/drawing/2016/5/11/chartex" xmlns:cx6="http://schemas.microsoft.com/office/drawing/2016/5/12/chartex" xmlns:cx7="http://schemas.microsoft.com/office/drawing/2016/5/13/chartex" xmlns:cx8="http://schemas.microsoft.com/office/drawing/2016/5/14/chartex" xmlns:mc="http://schemas.openxmlformats.org/markup-compatibility/2006" xmlns:m="http://schemas.openxmlformats.org/officeDocument/2006/math" xmlns:aink="http://schemas.microsoft.com/office/drawing/2016/ink" xmlns:am3d="http://schemas.microsoft.com/office/drawing/2017/model3d" xmlns:oel="http://schemas.microsoft.com/office/2019/extlst" xmlns:r="http://schemas.openxmlformats.org/officeDocument/2006/relationships" xmlns:wp14="http://schemas.microsoft.com/office/word/2010/wordprocessingDrawing" xmlns:wp="http://schemas.openxmlformats.org/drawingml/2006/wordprocessingDrawing" xmlns:wpg="http://schemas.microsoft.com/office/word/2010/wordprocessingGroup" xmlns:wpi="http://schemas.microsoft.com/office/word/2010/wordprocessingInk" xmlns:wps="http://schemas.microsoft.com/office/word/2010/wordprocessingShape" xmlns:o="urn:schemas-microsoft-com:office:office" xmlns:v="urn:schemas-microsoft-com:vml" xmlns:w10="urn:schemas-microsoft-com:office:word" xmlns:w="http://schemas.openxmlformats.org/wordprocessingml/2006/main" xmlns:w14="http://schemas.microsoft.com/office/word/2010/wordml" xmlns:w15="http://schemas.microsoft.com/office/word/2012/wordml" xmlns:w16cei="http://schemas.microsoft.com/office/word/2026/wordml/cei" xmlns:w16cex="http://schemas.microsoft.com/office/word/2018/wordml/cex" xmlns:w16cid="http://schemas.microsoft.com/office/word/2016/wordml/cid" xmlns:w16="http://schemas.microsoft.com/office/word/2018/wordml" xmlns:w16sdtdh="http://schemas.microsoft.com/office/word/2020/wordml/sdtdatahash" xmlns:w16sdtfl="http://schemas.microsoft.com/office/word/2024/wordml/sdtformatlock" xmlns:w16se="http://schemas.microsoft.com/office/word/2015/wordml/symex" xmlns:w16du="http://schemas.microsoft.com/office/word/2023/wordml/word16du" xmlns:wne="http://schemas.microsoft.com/office/word/2006/wordml" mc:Ignorable="w14 w15 w16se w16cid w16 w16cex w16sdtdh w16sdtfl w16du wp14">
   <w:tbl>
     <w:tblPr>
       <w:tblStyle w:val="TableGrid"/>
@@ -8377,7 +8280,7 @@
 </file>
 
 <file path=word/footnotes.xml><?xml version="1.0" encoding="utf-8"?>
-<w:footnotes xmlns:wpc="http://schemas.microsoft.com/office/word/2010/wordprocessingCanvas" xmlns:cx="http://schemas.microsoft.com/office/drawing/2014/chartex" xmlns:cx1="http://schemas.microsoft.com/office/drawing/2015/9/8/chartex" xmlns:cx2="http://schemas.microsoft.com/office/drawing/2015/10/21/chartex" xmlns:cx3="http://schemas.microsoft.com/office/drawing/2016/5/9/chartex" xmlns:cx4="http://schemas.microsoft.com/office/drawing/2016/5/10/chartex" xmlns:cx5="http://schemas.microsoft.com/office/drawing/2016/5/11/chartex" xmlns:cx6="http://schemas.microsoft.com/office/drawing/2016/5/12/chartex" xmlns:cx7="http://schemas.microsoft.com/office/drawing/2016/5/13/chartex" xmlns:cx8="http://schemas.microsoft.com/office/drawing/2016/5/14/chartex" xmlns:mc="http://schemas.openxmlformats.org/markup-compatibility/2006" xmlns:aink="http://schemas.microsoft.com/office/drawing/2016/ink" xmlns:am3d="http://schemas.microsoft.com/office/drawing/2017/model3d" xmlns:o="urn:schemas-microsoft-com:office:office" xmlns:oel="http://schemas.microsoft.com/office/2019/extlst" xmlns:r="http://schemas.openxmlformats.org/officeDocument/2006/relationships" xmlns:m="http://schemas.openxmlformats.org/officeDocument/2006/math" xmlns:v="urn:schemas-microsoft-com:vml" xmlns:wp14="http://schemas.microsoft.com/office/word/2010/wordprocessingDrawing" xmlns:wp="http://schemas.openxmlformats.org/drawingml/2006/wordprocessingDrawing" xmlns:w10="urn:schemas-microsoft-com:office:word" xmlns:w="http://schemas.openxmlformats.org/wordprocessingml/2006/main" xmlns:w14="http://schemas.microsoft.com/office/word/2010/wordml" xmlns:w15="http://schemas.microsoft.com/office/word/2012/wordml" xmlns:w16cex="http://schemas.microsoft.com/office/word/2018/wordml/cex" xmlns:w16cid="http://schemas.microsoft.com/office/word/2016/wordml/cid" xmlns:w16="http://schemas.microsoft.com/office/word/2018/wordml" xmlns:w16du="http://schemas.microsoft.com/office/word/2023/wordml/word16du" xmlns:w16sdtdh="http://schemas.microsoft.com/office/word/2020/wordml/sdtdatahash" xmlns:w16sdtfl="http://schemas.microsoft.com/office/word/2024/wordml/sdtformatlock" xmlns:w16se="http://schemas.microsoft.com/office/word/2015/wordml/symex" xmlns:wpg="http://schemas.microsoft.com/office/word/2010/wordprocessingGroup" xmlns:wpi="http://schemas.microsoft.com/office/word/2010/wordprocessingInk" xmlns:wne="http://schemas.microsoft.com/office/word/2006/wordml" xmlns:wps="http://schemas.microsoft.com/office/word/2010/wordprocessingShape" mc:Ignorable="w14 w15 w16se w16cid w16 w16cex w16sdtdh w16sdtfl w16du wp14">
+<w:footnotes xmlns:wpc="http://schemas.microsoft.com/office/word/2010/wordprocessingCanvas" xmlns:cx="http://schemas.microsoft.com/office/drawing/2014/chartex" xmlns:cx1="http://schemas.microsoft.com/office/drawing/2015/9/8/chartex" xmlns:cx2="http://schemas.microsoft.com/office/drawing/2015/10/21/chartex" xmlns:cx3="http://schemas.microsoft.com/office/drawing/2016/5/9/chartex" xmlns:cx4="http://schemas.microsoft.com/office/drawing/2016/5/10/chartex" xmlns:cx5="http://schemas.microsoft.com/office/drawing/2016/5/11/chartex" xmlns:cx6="http://schemas.microsoft.com/office/drawing/2016/5/12/chartex" xmlns:cx7="http://schemas.microsoft.com/office/drawing/2016/5/13/chartex" xmlns:cx8="http://schemas.microsoft.com/office/drawing/2016/5/14/chartex" xmlns:mc="http://schemas.openxmlformats.org/markup-compatibility/2006" xmlns:m="http://schemas.openxmlformats.org/officeDocument/2006/math" xmlns:aink="http://schemas.microsoft.com/office/drawing/2016/ink" xmlns:am3d="http://schemas.microsoft.com/office/drawing/2017/model3d" xmlns:oel="http://schemas.microsoft.com/office/2019/extlst" xmlns:r="http://schemas.openxmlformats.org/officeDocument/2006/relationships" xmlns:wp14="http://schemas.microsoft.com/office/word/2010/wordprocessingDrawing" xmlns:wp="http://schemas.openxmlformats.org/drawingml/2006/wordprocessingDrawing" xmlns:wpg="http://schemas.microsoft.com/office/word/2010/wordprocessingGroup" xmlns:wpi="http://schemas.microsoft.com/office/word/2010/wordprocessingInk" xmlns:wps="http://schemas.microsoft.com/office/word/2010/wordprocessingShape" xmlns:o="urn:schemas-microsoft-com:office:office" xmlns:v="urn:schemas-microsoft-com:vml" xmlns:w10="urn:schemas-microsoft-com:office:word" xmlns:w="http://schemas.openxmlformats.org/wordprocessingml/2006/main" xmlns:w14="http://schemas.microsoft.com/office/word/2010/wordml" xmlns:w15="http://schemas.microsoft.com/office/word/2012/wordml" xmlns:w16cei="http://schemas.microsoft.com/office/word/2026/wordml/cei" xmlns:w16cex="http://schemas.microsoft.com/office/word/2018/wordml/cex" xmlns:w16cid="http://schemas.microsoft.com/office/word/2016/wordml/cid" xmlns:w16="http://schemas.microsoft.com/office/word/2018/wordml" xmlns:w16sdtdh="http://schemas.microsoft.com/office/word/2020/wordml/sdtdatahash" xmlns:w16sdtfl="http://schemas.microsoft.com/office/word/2024/wordml/sdtformatlock" xmlns:w16se="http://schemas.microsoft.com/office/word/2015/wordml/symex" xmlns:w16du="http://schemas.microsoft.com/office/word/2023/wordml/word16du" xmlns:wne="http://schemas.microsoft.com/office/word/2006/wordml" mc:Ignorable="w14 w15 w16se w16cid w16 w16cex w16sdtdh w16sdtfl w16du wp14">
   <w:footnote w:type="separator" w:id="-1">
     <w:p>
       <w:r>
@@ -8396,7 +8299,7 @@
 </file>
 
 <file path=word/header1.xml><?xml version="1.0" encoding="utf-8"?>
-<w:hdr xmlns:wpc="http://schemas.microsoft.com/office/word/2010/wordprocessingCanvas" xmlns:cx="http://schemas.microsoft.com/office/drawing/2014/chartex" xmlns:cx1="http://schemas.microsoft.com/office/drawing/2015/9/8/chartex" xmlns:cx2="http://schemas.microsoft.com/office/drawing/2015/10/21/chartex" xmlns:cx3="http://schemas.microsoft.com/office/drawing/2016/5/9/chartex" xmlns:cx4="http://schemas.microsoft.com/office/drawing/2016/5/10/chartex" xmlns:cx5="http://schemas.microsoft.com/office/drawing/2016/5/11/chartex" xmlns:cx6="http://schemas.microsoft.com/office/drawing/2016/5/12/chartex" xmlns:cx7="http://schemas.microsoft.com/office/drawing/2016/5/13/chartex" xmlns:cx8="http://schemas.microsoft.com/office/drawing/2016/5/14/chartex" xmlns:mc="http://schemas.openxmlformats.org/markup-compatibility/2006" xmlns:aink="http://schemas.microsoft.com/office/drawing/2016/ink" xmlns:am3d="http://schemas.microsoft.com/office/drawing/2017/model3d" xmlns:o="urn:schemas-microsoft-com:office:office" xmlns:oel="http://schemas.microsoft.com/office/2019/extlst" xmlns:r="http://schemas.openxmlformats.org/officeDocument/2006/relationships" xmlns:m="http://schemas.openxmlformats.org/officeDocument/2006/math" xmlns:v="urn:schemas-microsoft-com:vml" xmlns:wp14="http://schemas.microsoft.com/office/word/2010/wordprocessingDrawing" xmlns:wp="http://schemas.openxmlformats.org/drawingml/2006/wordprocessingDrawing" xmlns:w10="urn:schemas-microsoft-com:office:word" xmlns:w="http://schemas.openxmlformats.org/wordprocessingml/2006/main" xmlns:w14="http://schemas.microsoft.com/office/word/2010/wordml" xmlns:w15="http://schemas.microsoft.com/office/word/2012/wordml" xmlns:w16cex="http://schemas.microsoft.com/office/word/2018/wordml/cex" xmlns:w16cid="http://schemas.microsoft.com/office/word/2016/wordml/cid" xmlns:w16="http://schemas.microsoft.com/office/word/2018/wordml" xmlns:w16du="http://schemas.microsoft.com/office/word/2023/wordml/word16du" xmlns:w16sdtdh="http://schemas.microsoft.com/office/word/2020/wordml/sdtdatahash" xmlns:w16sdtfl="http://schemas.microsoft.com/office/word/2024/wordml/sdtformatlock" xmlns:w16se="http://schemas.microsoft.com/office/word/2015/wordml/symex" xmlns:wpg="http://schemas.microsoft.com/office/word/2010/wordprocessingGroup" xmlns:wpi="http://schemas.microsoft.com/office/word/2010/wordprocessingInk" xmlns:wne="http://schemas.microsoft.com/office/word/2006/wordml" xmlns:wps="http://schemas.microsoft.com/office/word/2010/wordprocessingShape" mc:Ignorable="w14 w15 w16se w16cid w16 w16cex w16sdtdh w16sdtfl w16du wp14">
+<w:hdr xmlns:wpc="http://schemas.microsoft.com/office/word/2010/wordprocessingCanvas" xmlns:cx="http://schemas.microsoft.com/office/drawing/2014/chartex" xmlns:cx1="http://schemas.microsoft.com/office/drawing/2015/9/8/chartex" xmlns:cx2="http://schemas.microsoft.com/office/drawing/2015/10/21/chartex" xmlns:cx3="http://schemas.microsoft.com/office/drawing/2016/5/9/chartex" xmlns:cx4="http://schemas.microsoft.com/office/drawing/2016/5/10/chartex" xmlns:cx5="http://schemas.microsoft.com/office/drawing/2016/5/11/chartex" xmlns:cx6="http://schemas.microsoft.com/office/drawing/2016/5/12/chartex" xmlns:cx7="http://schemas.microsoft.com/office/drawing/2016/5/13/chartex" xmlns:cx8="http://schemas.microsoft.com/office/drawing/2016/5/14/chartex" xmlns:mc="http://schemas.openxmlformats.org/markup-compatibility/2006" xmlns:m="http://schemas.openxmlformats.org/officeDocument/2006/math" xmlns:aink="http://schemas.microsoft.com/office/drawing/2016/ink" xmlns:am3d="http://schemas.microsoft.com/office/drawing/2017/model3d" xmlns:oel="http://schemas.microsoft.com/office/2019/extlst" xmlns:r="http://schemas.openxmlformats.org/officeDocument/2006/relationships" xmlns:wp14="http://schemas.microsoft.com/office/word/2010/wordprocessingDrawing" xmlns:wp="http://schemas.openxmlformats.org/drawingml/2006/wordprocessingDrawing" xmlns:wpg="http://schemas.microsoft.com/office/word/2010/wordprocessingGroup" xmlns:wpi="http://schemas.microsoft.com/office/word/2010/wordprocessingInk" xmlns:wps="http://schemas.microsoft.com/office/word/2010/wordprocessingShape" xmlns:o="urn:schemas-microsoft-com:office:office" xmlns:v="urn:schemas-microsoft-com:vml" xmlns:w10="urn:schemas-microsoft-com:office:word" xmlns:w="http://schemas.openxmlformats.org/wordprocessingml/2006/main" xmlns:w14="http://schemas.microsoft.com/office/word/2010/wordml" xmlns:w15="http://schemas.microsoft.com/office/word/2012/wordml" xmlns:w16cei="http://schemas.microsoft.com/office/word/2026/wordml/cei" xmlns:w16cex="http://schemas.microsoft.com/office/word/2018/wordml/cex" xmlns:w16cid="http://schemas.microsoft.com/office/word/2016/wordml/cid" xmlns:w16="http://schemas.microsoft.com/office/word/2018/wordml" xmlns:w16sdtdh="http://schemas.microsoft.com/office/word/2020/wordml/sdtdatahash" xmlns:w16sdtfl="http://schemas.microsoft.com/office/word/2024/wordml/sdtformatlock" xmlns:w16se="http://schemas.microsoft.com/office/word/2015/wordml/symex" xmlns:w16du="http://schemas.microsoft.com/office/word/2023/wordml/word16du" xmlns:wne="http://schemas.microsoft.com/office/word/2006/wordml" mc:Ignorable="w14 w15 w16se w16cid w16 w16cex w16sdtdh w16sdtfl w16du wp14">
   <w:p>
     <w:pPr>
       <w:pStyle w:val="Header"/>
@@ -8523,7 +8426,7 @@
         <w:sz w:val="20"/>
         <w:szCs w:val="20"/>
       </w:rPr>
-      <w:t>1</w:t>
+      <w:t>23</w:t>
     </w:r>
     <w:r>
       <w:rPr>
@@ -8539,7 +8442,7 @@
         <w:sz w:val="20"/>
         <w:szCs w:val="20"/>
       </w:rPr>
-      <w:t>3</w:t>
+      <w:t>7</w:t>
     </w:r>
     <w:r>
       <w:rPr>
@@ -8570,7 +8473,7 @@
 </file>
 
 <file path=word/numbering.xml><?xml version="1.0" encoding="utf-8"?>
-<w:numbering xmlns:wpc="http://schemas.microsoft.com/office/word/2010/wordprocessingCanvas" xmlns:cx="http://schemas.microsoft.com/office/drawing/2014/chartex" xmlns:cx1="http://schemas.microsoft.com/office/drawing/2015/9/8/chartex" xmlns:cx2="http://schemas.microsoft.com/office/drawing/2015/10/21/chartex" xmlns:cx3="http://schemas.microsoft.com/office/drawing/2016/5/9/chartex" xmlns:cx4="http://schemas.microsoft.com/office/drawing/2016/5/10/chartex" xmlns:cx5="http://schemas.microsoft.com/office/drawing/2016/5/11/chartex" xmlns:cx6="http://schemas.microsoft.com/office/drawing/2016/5/12/chartex" xmlns:cx7="http://schemas.microsoft.com/office/drawing/2016/5/13/chartex" xmlns:cx8="http://schemas.microsoft.com/office/drawing/2016/5/14/chartex" xmlns:mc="http://schemas.openxmlformats.org/markup-compatibility/2006" xmlns:aink="http://schemas.microsoft.com/office/drawing/2016/ink" xmlns:am3d="http://schemas.microsoft.com/office/drawing/2017/model3d" xmlns:o="urn:schemas-microsoft-com:office:office" xmlns:oel="http://schemas.microsoft.com/office/2019/extlst" xmlns:r="http://schemas.openxmlformats.org/officeDocument/2006/relationships" xmlns:m="http://schemas.openxmlformats.org/officeDocument/2006/math" xmlns:v="urn:schemas-microsoft-com:vml" xmlns:wp14="http://schemas.microsoft.com/office/word/2010/wordprocessingDrawing" xmlns:wp="http://schemas.openxmlformats.org/drawingml/2006/wordprocessingDrawing" xmlns:w10="urn:schemas-microsoft-com:office:word" xmlns:w="http://schemas.openxmlformats.org/wordprocessingml/2006/main" xmlns:w14="http://schemas.microsoft.com/office/word/2010/wordml" xmlns:w15="http://schemas.microsoft.com/office/word/2012/wordml" xmlns:w16cex="http://schemas.microsoft.com/office/word/2018/wordml/cex" xmlns:w16cid="http://schemas.microsoft.com/office/word/2016/wordml/cid" xmlns:w16="http://schemas.microsoft.com/office/word/2018/wordml" xmlns:w16du="http://schemas.microsoft.com/office/word/2023/wordml/word16du" xmlns:w16sdtdh="http://schemas.microsoft.com/office/word/2020/wordml/sdtdatahash" xmlns:w16sdtfl="http://schemas.microsoft.com/office/word/2024/wordml/sdtformatlock" xmlns:w16se="http://schemas.microsoft.com/office/word/2015/wordml/symex" xmlns:wpg="http://schemas.microsoft.com/office/word/2010/wordprocessingGroup" xmlns:wpi="http://schemas.microsoft.com/office/word/2010/wordprocessingInk" xmlns:wne="http://schemas.microsoft.com/office/word/2006/wordml" xmlns:wps="http://schemas.microsoft.com/office/word/2010/wordprocessingShape" mc:Ignorable="w14 w15 w16se w16cid w16 w16cex w16sdtdh w16sdtfl w16du wp14">
+<w:numbering xmlns:wpc="http://schemas.microsoft.com/office/word/2010/wordprocessingCanvas" xmlns:cx="http://schemas.microsoft.com/office/drawing/2014/chartex" xmlns:cx1="http://schemas.microsoft.com/office/drawing/2015/9/8/chartex" xmlns:cx2="http://schemas.microsoft.com/office/drawing/2015/10/21/chartex" xmlns:cx3="http://schemas.microsoft.com/office/drawing/2016/5/9/chartex" xmlns:cx4="http://schemas.microsoft.com/office/drawing/2016/5/10/chartex" xmlns:cx5="http://schemas.microsoft.com/office/drawing/2016/5/11/chartex" xmlns:cx6="http://schemas.microsoft.com/office/drawing/2016/5/12/chartex" xmlns:cx7="http://schemas.microsoft.com/office/drawing/2016/5/13/chartex" xmlns:cx8="http://schemas.microsoft.com/office/drawing/2016/5/14/chartex" xmlns:mc="http://schemas.openxmlformats.org/markup-compatibility/2006" xmlns:m="http://schemas.openxmlformats.org/officeDocument/2006/math" xmlns:aink="http://schemas.microsoft.com/office/drawing/2016/ink" xmlns:am3d="http://schemas.microsoft.com/office/drawing/2017/model3d" xmlns:oel="http://schemas.microsoft.com/office/2019/extlst" xmlns:r="http://schemas.openxmlformats.org/officeDocument/2006/relationships" xmlns:wp14="http://schemas.microsoft.com/office/word/2010/wordprocessingDrawing" xmlns:wp="http://schemas.openxmlformats.org/drawingml/2006/wordprocessingDrawing" xmlns:wpg="http://schemas.microsoft.com/office/word/2010/wordprocessingGroup" xmlns:wpi="http://schemas.microsoft.com/office/word/2010/wordprocessingInk" xmlns:wps="http://schemas.microsoft.com/office/word/2010/wordprocessingShape" xmlns:o="urn:schemas-microsoft-com:office:office" xmlns:v="urn:schemas-microsoft-com:vml" xmlns:w10="urn:schemas-microsoft-com:office:word" xmlns:w="http://schemas.openxmlformats.org/wordprocessingml/2006/main" xmlns:w14="http://schemas.microsoft.com/office/word/2010/wordml" xmlns:w15="http://schemas.microsoft.com/office/word/2012/wordml" xmlns:w16cei="http://schemas.microsoft.com/office/word/2026/wordml/cei" xmlns:w16cex="http://schemas.microsoft.com/office/word/2018/wordml/cex" xmlns:w16cid="http://schemas.microsoft.com/office/word/2016/wordml/cid" xmlns:w16="http://schemas.microsoft.com/office/word/2018/wordml" xmlns:w16sdtdh="http://schemas.microsoft.com/office/word/2020/wordml/sdtdatahash" xmlns:w16sdtfl="http://schemas.microsoft.com/office/word/2024/wordml/sdtformatlock" xmlns:w16se="http://schemas.microsoft.com/office/word/2015/wordml/symex" xmlns:w16du="http://schemas.microsoft.com/office/word/2023/wordml/word16du" xmlns:wne="http://schemas.microsoft.com/office/word/2006/wordml" mc:Ignorable="w14 w15 w16se w16cid w16 w16cex w16sdtdh w16sdtfl w16du wp14">
   <w:abstractNum w:abstractNumId="0" w15:restartNumberingAfterBreak="0">
     <w:nsid w:val="02E361A8"/>
     <w:multiLevelType w:val="hybridMultilevel"/>
@@ -10998,7 +10901,7 @@
 </file>
 
 <file path=word/styles.xml><?xml version="1.0" encoding="utf-8"?>
-<w:styles xmlns:mc="http://schemas.openxmlformats.org/markup-compatibility/2006" xmlns:r="http://schemas.openxmlformats.org/officeDocument/2006/relationships" xmlns:w="http://schemas.openxmlformats.org/wordprocessingml/2006/main" xmlns:w14="http://schemas.microsoft.com/office/word/2010/wordml" xmlns:w15="http://schemas.microsoft.com/office/word/2012/wordml" xmlns:w16cex="http://schemas.microsoft.com/office/word/2018/wordml/cex" xmlns:w16cid="http://schemas.microsoft.com/office/word/2016/wordml/cid" xmlns:w16="http://schemas.microsoft.com/office/word/2018/wordml" xmlns:w16du="http://schemas.microsoft.com/office/word/2023/wordml/word16du" xmlns:w16sdtdh="http://schemas.microsoft.com/office/word/2020/wordml/sdtdatahash" xmlns:w16sdtfl="http://schemas.microsoft.com/office/word/2024/wordml/sdtformatlock" xmlns:w16se="http://schemas.microsoft.com/office/word/2015/wordml/symex" mc:Ignorable="w14 w15 w16se w16cid w16 w16cex w16sdtdh w16sdtfl w16du">
+<w:styles xmlns:mc="http://schemas.openxmlformats.org/markup-compatibility/2006" xmlns:r="http://schemas.openxmlformats.org/officeDocument/2006/relationships" xmlns:w="http://schemas.openxmlformats.org/wordprocessingml/2006/main" xmlns:w14="http://schemas.microsoft.com/office/word/2010/wordml" xmlns:w15="http://schemas.microsoft.com/office/word/2012/wordml" xmlns:w16cex="http://schemas.microsoft.com/office/word/2018/wordml/cex" xmlns:w16cid="http://schemas.microsoft.com/office/word/2016/wordml/cid" xmlns:w16="http://schemas.microsoft.com/office/word/2018/wordml" xmlns:w16sdtdh="http://schemas.microsoft.com/office/word/2020/wordml/sdtdatahash" xmlns:w16sdtfl="http://schemas.microsoft.com/office/word/2024/wordml/sdtformatlock" xmlns:w16se="http://schemas.microsoft.com/office/word/2015/wordml/symex" xmlns:w16du="http://schemas.microsoft.com/office/word/2023/wordml/word16du" mc:Ignorable="w14 w15 w16se w16cid w16 w16cex w16sdtdh w16sdtfl w16du">
   <w:docDefaults>
     <w:rPrDefault>
       <w:rPr>
@@ -11476,7 +11379,6 @@
   <w:style w:type="character" w:default="1" w:styleId="DefaultParagraphFont">
     <w:name w:val="Default Paragraph Font"/>
     <w:uiPriority w:val="1"/>
-    <w:semiHidden/>
     <w:unhideWhenUsed/>
   </w:style>
   <w:style w:type="table" w:default="1" w:styleId="TableNormal">

</xml_diff>